<commit_message>
Add data processing scripts and update Excel files for REDCap integration
</commit_message>
<xml_diff>
--- a/ATA 2026 Proposal(1).docx
+++ b/ATA 2026 Proposal(1).docx
@@ -1,6 +1,6 @@
 
 <file path=word/document.xml><?xml version="1.0" encoding="utf-8"?>
-<w:document xmlns:wpc="http://schemas.microsoft.com/office/word/2010/wordprocessingCanvas" xmlns:cx="http://schemas.microsoft.com/office/drawing/2014/chartex" xmlns:cx1="http://schemas.microsoft.com/office/drawing/2015/9/8/chartex" xmlns:cx2="http://schemas.microsoft.com/office/drawing/2015/10/21/chartex" xmlns:cx3="http://schemas.microsoft.com/office/drawing/2016/5/9/chartex" xmlns:cx4="http://schemas.microsoft.com/office/drawing/2016/5/10/chartex" xmlns:cx5="http://schemas.microsoft.com/office/drawing/2016/5/11/chartex" xmlns:cx6="http://schemas.microsoft.com/office/drawing/2016/5/12/chartex" xmlns:cx7="http://schemas.microsoft.com/office/drawing/2016/5/13/chartex" xmlns:cx8="http://schemas.microsoft.com/office/drawing/2016/5/14/chartex" xmlns:mc="http://schemas.openxmlformats.org/markup-compatibility/2006" xmlns:aink="http://schemas.microsoft.com/office/drawing/2016/ink" xmlns:am3d="http://schemas.microsoft.com/office/drawing/2017/model3d" xmlns:o="urn:schemas-microsoft-com:office:office" xmlns:r="http://schemas.openxmlformats.org/officeDocument/2006/relationships" xmlns:m="http://schemas.openxmlformats.org/officeDocument/2006/math" xmlns:v="urn:schemas-microsoft-com:vml" xmlns:wp14="http://schemas.microsoft.com/office/word/2010/wordprocessingDrawing" xmlns:wp="http://schemas.openxmlformats.org/drawingml/2006/wordprocessingDrawing" xmlns:w10="urn:schemas-microsoft-com:office:word" xmlns:w="http://schemas.openxmlformats.org/wordprocessingml/2006/main" xmlns:w14="http://schemas.microsoft.com/office/word/2010/wordml" xmlns:w15="http://schemas.microsoft.com/office/word/2012/wordml" xmlns:w16cid="http://schemas.microsoft.com/office/word/2016/wordml/cid" xmlns:w16se="http://schemas.microsoft.com/office/word/2015/wordml/symex" xmlns:wpg="http://schemas.microsoft.com/office/word/2010/wordprocessingGroup" xmlns:wpi="http://schemas.microsoft.com/office/word/2010/wordprocessingInk" xmlns:wne="http://schemas.microsoft.com/office/word/2006/wordml" xmlns:wps="http://schemas.microsoft.com/office/word/2010/wordprocessingShape" mc:Ignorable="w14 w15 w16se w16cid wp14">
+<w:document xmlns:wpc="http://schemas.microsoft.com/office/word/2010/wordprocessingCanvas" xmlns:cx="http://schemas.microsoft.com/office/drawing/2014/chartex" xmlns:cx1="http://schemas.microsoft.com/office/drawing/2015/9/8/chartex" xmlns:cx2="http://schemas.microsoft.com/office/drawing/2015/10/21/chartex" xmlns:cx3="http://schemas.microsoft.com/office/drawing/2016/5/9/chartex" xmlns:cx4="http://schemas.microsoft.com/office/drawing/2016/5/10/chartex" xmlns:cx5="http://schemas.microsoft.com/office/drawing/2016/5/11/chartex" xmlns:cx6="http://schemas.microsoft.com/office/drawing/2016/5/12/chartex" xmlns:cx7="http://schemas.microsoft.com/office/drawing/2016/5/13/chartex" xmlns:cx8="http://schemas.microsoft.com/office/drawing/2016/5/14/chartex" xmlns:mc="http://schemas.openxmlformats.org/markup-compatibility/2006" xmlns:aink="http://schemas.microsoft.com/office/drawing/2016/ink" xmlns:am3d="http://schemas.microsoft.com/office/drawing/2017/model3d" xmlns:o="urn:schemas-microsoft-com:office:office" xmlns:oel="http://schemas.microsoft.com/office/2019/extlst" xmlns:r="http://schemas.openxmlformats.org/officeDocument/2006/relationships" xmlns:m="http://schemas.openxmlformats.org/officeDocument/2006/math" xmlns:v="urn:schemas-microsoft-com:vml" xmlns:wp14="http://schemas.microsoft.com/office/word/2010/wordprocessingDrawing" xmlns:wp="http://schemas.openxmlformats.org/drawingml/2006/wordprocessingDrawing" xmlns:w10="urn:schemas-microsoft-com:office:word" xmlns:w="http://schemas.openxmlformats.org/wordprocessingml/2006/main" xmlns:w14="http://schemas.microsoft.com/office/word/2010/wordml" xmlns:w15="http://schemas.microsoft.com/office/word/2012/wordml" xmlns:w16cex="http://schemas.microsoft.com/office/word/2018/wordml/cex" xmlns:w16cid="http://schemas.microsoft.com/office/word/2016/wordml/cid" xmlns:w16="http://schemas.microsoft.com/office/word/2018/wordml" xmlns:w16du="http://schemas.microsoft.com/office/word/2023/wordml/word16du" xmlns:w16sdtdh="http://schemas.microsoft.com/office/word/2020/wordml/sdtdatahash" xmlns:w16sdtfl="http://schemas.microsoft.com/office/word/2024/wordml/sdtformatlock" xmlns:w16se="http://schemas.microsoft.com/office/word/2015/wordml/symex" xmlns:wpg="http://schemas.microsoft.com/office/word/2010/wordprocessingGroup" xmlns:wpi="http://schemas.microsoft.com/office/word/2010/wordprocessingInk" xmlns:wne="http://schemas.microsoft.com/office/word/2006/wordml" xmlns:wps="http://schemas.microsoft.com/office/word/2010/wordprocessingShape" mc:Ignorable="w14 w15 w16se w16cid w16 w16cex w16sdtdh w16sdtfl w16du wp14">
   <w:body>
     <w:p>
       <w:pPr>
@@ -81,20 +81,8 @@
           <w:szCs w:val="22"/>
           <w:lang w:val="en-US"/>
         </w:rPr>
-        <w:t xml:space="preserve">Paola Solis- </w:t>
-      </w:r>
-      <w:proofErr w:type="spellStart"/>
-      <w:r>
-        <w:rPr>
-          <w:rFonts w:ascii="Times New Roman" w:eastAsia="Times New Roman" w:hAnsi="Times New Roman" w:cs="Times New Roman"/>
-          <w:bCs/>
-          <w:sz w:val="22"/>
-          <w:szCs w:val="22"/>
-          <w:lang w:val="en-US"/>
-        </w:rPr>
-        <w:t>Pazmino</w:t>
-      </w:r>
-      <w:proofErr w:type="spellEnd"/>
+        <w:t>Paola Solis- Pazmino</w:t>
+      </w:r>
     </w:p>
     <w:p>
       <w:pPr>
@@ -567,7 +555,6 @@
             <w:docPart w:val="047D0F77BAA7AE4CA7262B9984A5DE95"/>
           </w:placeholder>
         </w:sdtPr>
-        <w:sdtEndPr/>
         <w:sdtContent>
           <w:r>
             <w:rPr>
@@ -618,7 +605,6 @@
             <w:docPart w:val="812704D1A42FD741B2724D9014D92BDE"/>
           </w:placeholder>
         </w:sdtPr>
-        <w:sdtEndPr/>
         <w:sdtContent>
           <w:r>
             <w:rPr>
@@ -705,7 +691,6 @@
             <w:docPart w:val="F58A0FDE27827349B76E6B49E75B8989"/>
           </w:placeholder>
         </w:sdtPr>
-        <w:sdtEndPr/>
         <w:sdtContent>
           <w:r>
             <w:rPr>
@@ -774,7 +759,6 @@
             <w:docPart w:val="DefaultPlaceholder_-1854013440"/>
           </w:placeholder>
         </w:sdtPr>
-        <w:sdtEndPr/>
         <w:sdtContent>
           <w:r>
             <w:rPr>
@@ -841,7 +825,6 @@
             <w:docPart w:val="DefaultPlaceholder_-1854013440"/>
           </w:placeholder>
         </w:sdtPr>
-        <w:sdtEndPr/>
         <w:sdtContent>
           <w:r>
             <w:rPr>
@@ -917,7 +900,6 @@
             <w:docPart w:val="DefaultPlaceholder_-1854013440"/>
           </w:placeholder>
         </w:sdtPr>
-        <w:sdtEndPr/>
         <w:sdtContent>
           <w:r>
             <w:rPr>
@@ -1029,7 +1011,6 @@
             <w:docPart w:val="DefaultPlaceholder_-1854013440"/>
           </w:placeholder>
         </w:sdtPr>
-        <w:sdtEndPr/>
         <w:sdtContent>
           <w:r>
             <w:rPr>
@@ -1069,7 +1050,6 @@
             <w:docPart w:val="DefaultPlaceholder_-1854013440"/>
           </w:placeholder>
         </w:sdtPr>
-        <w:sdtEndPr/>
         <w:sdtContent>
           <w:r>
             <w:rPr>
@@ -1131,7 +1111,6 @@
             <w:docPart w:val="DefaultPlaceholder_-1854013440"/>
           </w:placeholder>
         </w:sdtPr>
-        <w:sdtEndPr/>
         <w:sdtContent>
           <w:r>
             <w:rPr>
@@ -1180,7 +1159,6 @@
             <w:docPart w:val="DefaultPlaceholder_-1854013440"/>
           </w:placeholder>
         </w:sdtPr>
-        <w:sdtEndPr/>
         <w:sdtContent>
           <w:r>
             <w:rPr>
@@ -1229,7 +1207,6 @@
             <w:docPart w:val="DefaultPlaceholder_-1854013440"/>
           </w:placeholder>
         </w:sdtPr>
-        <w:sdtEndPr/>
         <w:sdtContent>
           <w:r>
             <w:rPr>
@@ -1307,7 +1284,6 @@
             <w:docPart w:val="DefaultPlaceholder_-1854013440"/>
           </w:placeholder>
         </w:sdtPr>
-        <w:sdtEndPr/>
         <w:sdtContent>
           <w:r>
             <w:rPr>
@@ -1730,7 +1706,6 @@
             <w:docPart w:val="DefaultPlaceholder_-1854013440"/>
           </w:placeholder>
         </w:sdtPr>
-        <w:sdtEndPr/>
         <w:sdtContent>
           <w:r>
             <w:rPr>
@@ -1783,7 +1758,17 @@
           <w:szCs w:val="22"/>
           <w:lang w:val="en-US"/>
         </w:rPr>
-        <w:t>Building on this established infrastructure, we launched the CaTaLiN</w:t>
+        <w:t xml:space="preserve">Building on this established infrastructure, we launched the </w:t>
+      </w:r>
+      <w:proofErr w:type="spellStart"/>
+      <w:r>
+        <w:rPr>
+          <w:rFonts w:ascii="Times New Roman" w:eastAsia="Times New Roman" w:hAnsi="Times New Roman" w:cs="Times New Roman"/>
+          <w:sz w:val="22"/>
+          <w:szCs w:val="22"/>
+          <w:lang w:val="en-US"/>
+        </w:rPr>
+        <w:t>CaTaLiN</w:t>
       </w:r>
       <w:r>
         <w:rPr>
@@ -1794,6 +1779,7 @@
         </w:rPr>
         <w:t>A</w:t>
       </w:r>
+      <w:proofErr w:type="spellEnd"/>
       <w:r>
         <w:rPr>
           <w:rFonts w:ascii="Times New Roman" w:eastAsia="Times New Roman" w:hAnsi="Times New Roman" w:cs="Times New Roman"/>
@@ -1977,7 +1963,6 @@
             <w:docPart w:val="DefaultPlaceholder_-1854013440"/>
           </w:placeholder>
         </w:sdtPr>
-        <w:sdtEndPr/>
         <w:sdtContent>
           <w:r>
             <w:rPr>
@@ -2123,7 +2108,7 @@
     </w:p>
     <w:p>
       <w:pPr>
-        <w:pStyle w:val="Prrafodelista"/>
+        <w:pStyle w:val="ListParagraph"/>
         <w:numPr>
           <w:ilvl w:val="0"/>
           <w:numId w:val="10"/>
@@ -2227,6 +2212,327 @@
           <w:rFonts w:ascii="Times New Roman" w:eastAsia="Times New Roman" w:hAnsi="Times New Roman" w:cs="Times New Roman"/>
           <w:sz w:val="22"/>
           <w:szCs w:val="22"/>
+          <w:highlight w:val="darkYellow"/>
+          <w:lang w:val="en-US"/>
+        </w:rPr>
+        <w:t xml:space="preserve">The missing data can </w:t>
+      </w:r>
+      <w:r>
+        <w:rPr>
+          <w:rFonts w:ascii="Times New Roman" w:eastAsia="Times New Roman" w:hAnsi="Times New Roman" w:cs="Times New Roman"/>
+          <w:sz w:val="22"/>
+          <w:szCs w:val="22"/>
+          <w:highlight w:val="darkYellow"/>
+          <w:lang w:val="en-US"/>
+        </w:rPr>
+        <w:t xml:space="preserve">adjusted </w:t>
+      </w:r>
+      <w:r>
+        <w:rPr>
+          <w:rFonts w:ascii="Times New Roman" w:eastAsia="Times New Roman" w:hAnsi="Times New Roman" w:cs="Times New Roman"/>
+          <w:sz w:val="22"/>
+          <w:szCs w:val="22"/>
+          <w:highlight w:val="darkYellow"/>
+          <w:lang w:val="en-US"/>
+        </w:rPr>
+        <w:t xml:space="preserve">on </w:t>
+      </w:r>
+      <w:r>
+        <w:rPr>
+          <w:rFonts w:ascii="Times New Roman" w:eastAsia="Times New Roman" w:hAnsi="Times New Roman" w:cs="Times New Roman"/>
+          <w:sz w:val="22"/>
+          <w:szCs w:val="22"/>
+          <w:highlight w:val="darkYellow"/>
+          <w:lang w:val="en-US"/>
+        </w:rPr>
+        <w:t>M</w:t>
+      </w:r>
+      <w:r>
+        <w:rPr>
+          <w:rFonts w:ascii="Times New Roman" w:eastAsia="Times New Roman" w:hAnsi="Times New Roman" w:cs="Times New Roman"/>
+          <w:sz w:val="22"/>
+          <w:szCs w:val="22"/>
+          <w:highlight w:val="darkYellow"/>
+          <w:lang w:val="en-US"/>
+        </w:rPr>
+        <w:t xml:space="preserve">NAR (“Missing Not At Random”) </w:t>
+      </w:r>
+      <w:r>
+        <w:rPr>
+          <w:rFonts w:ascii="Times New Roman" w:eastAsia="Times New Roman" w:hAnsi="Times New Roman" w:cs="Times New Roman"/>
+          <w:sz w:val="22"/>
+          <w:szCs w:val="22"/>
+          <w:highlight w:val="darkYellow"/>
+          <w:lang w:val="en-US"/>
+        </w:rPr>
+        <w:t xml:space="preserve">because </w:t>
+      </w:r>
+      <w:r>
+        <w:rPr>
+          <w:rFonts w:ascii="Times New Roman" w:eastAsia="Times New Roman" w:hAnsi="Times New Roman" w:cs="Times New Roman"/>
+          <w:sz w:val="22"/>
+          <w:szCs w:val="22"/>
+          <w:highlight w:val="darkYellow"/>
+          <w:lang w:val="en-US"/>
+        </w:rPr>
+        <w:t xml:space="preserve">"POSITIVELYMPHNODEN1", "NUMBEROFPOSITIVELYMPHNODEEXCISION", "LN RATIO", "SIZEOFPOSITIVELYMPHNODE(cm)", </w:t>
+      </w:r>
+      <w:r>
+        <w:rPr>
+          <w:rFonts w:ascii="Times New Roman" w:eastAsia="Times New Roman" w:hAnsi="Times New Roman" w:cs="Times New Roman"/>
+          <w:sz w:val="22"/>
+          <w:szCs w:val="22"/>
+          <w:highlight w:val="darkYellow"/>
+          <w:lang w:val="en-US"/>
+        </w:rPr>
+        <w:t xml:space="preserve">and </w:t>
+      </w:r>
+      <w:r>
+        <w:rPr>
+          <w:rFonts w:ascii="Times New Roman" w:eastAsia="Times New Roman" w:hAnsi="Times New Roman" w:cs="Times New Roman"/>
+          <w:sz w:val="22"/>
+          <w:szCs w:val="22"/>
+          <w:highlight w:val="darkYellow"/>
+          <w:lang w:val="en-US"/>
+        </w:rPr>
+        <w:t>"NUMBEROFLYMPHNODEEXCI</w:t>
+      </w:r>
+      <w:r>
+        <w:rPr>
+          <w:rFonts w:ascii="Times New Roman" w:eastAsia="Times New Roman" w:hAnsi="Times New Roman" w:cs="Times New Roman"/>
+          <w:sz w:val="22"/>
+          <w:szCs w:val="22"/>
+          <w:highlight w:val="darkYellow"/>
+          <w:lang w:val="en-US"/>
+        </w:rPr>
+        <w:t>SION</w:t>
+      </w:r>
+      <w:r>
+        <w:rPr>
+          <w:rFonts w:ascii="Times New Roman" w:eastAsia="Times New Roman" w:hAnsi="Times New Roman" w:cs="Times New Roman"/>
+          <w:sz w:val="22"/>
+          <w:szCs w:val="22"/>
+          <w:highlight w:val="darkYellow"/>
+          <w:lang w:val="en-US"/>
+        </w:rPr>
+        <w:t>”</w:t>
+      </w:r>
+      <w:r>
+        <w:rPr>
+          <w:rFonts w:ascii="Times New Roman" w:eastAsia="Times New Roman" w:hAnsi="Times New Roman" w:cs="Times New Roman"/>
+          <w:sz w:val="22"/>
+          <w:szCs w:val="22"/>
+          <w:highlight w:val="darkYellow"/>
+          <w:lang w:val="en-US"/>
+        </w:rPr>
+        <w:t xml:space="preserve"> could be missing as result of </w:t>
+      </w:r>
+      <w:r>
+        <w:rPr>
+          <w:rFonts w:ascii="Times New Roman" w:eastAsia="Times New Roman" w:hAnsi="Times New Roman" w:cs="Times New Roman"/>
+          <w:sz w:val="22"/>
+          <w:szCs w:val="22"/>
+          <w:highlight w:val="darkYellow"/>
+          <w:lang w:val="en-US"/>
+        </w:rPr>
+        <w:t>NUMBEROFLYMPHNODEEXCISION</w:t>
+      </w:r>
+      <w:r>
+        <w:rPr>
+          <w:rFonts w:ascii="Times New Roman" w:eastAsia="Times New Roman" w:hAnsi="Times New Roman" w:cs="Times New Roman"/>
+          <w:sz w:val="22"/>
+          <w:szCs w:val="22"/>
+          <w:highlight w:val="darkYellow"/>
+          <w:lang w:val="en-US"/>
+        </w:rPr>
+        <w:t xml:space="preserve"> == 0, </w:t>
+      </w:r>
+      <w:r>
+        <w:rPr>
+          <w:rFonts w:ascii="Times New Roman" w:eastAsia="Times New Roman" w:hAnsi="Times New Roman" w:cs="Times New Roman"/>
+          <w:sz w:val="22"/>
+          <w:szCs w:val="22"/>
+          <w:highlight w:val="darkYellow"/>
+          <w:lang w:val="en-US"/>
+        </w:rPr>
+        <w:t>and “</w:t>
+      </w:r>
+      <w:r>
+        <w:rPr>
+          <w:rFonts w:ascii="Times New Roman" w:eastAsia="Times New Roman" w:hAnsi="Times New Roman" w:cs="Times New Roman"/>
+          <w:sz w:val="22"/>
+          <w:szCs w:val="22"/>
+          <w:lang w:val="en-US"/>
+        </w:rPr>
+        <w:t>ANTI TG PRE</w:t>
+      </w:r>
+      <w:r>
+        <w:rPr>
+          <w:rFonts w:ascii="Times New Roman" w:eastAsia="Times New Roman" w:hAnsi="Times New Roman" w:cs="Times New Roman"/>
+          <w:sz w:val="22"/>
+          <w:szCs w:val="22"/>
+          <w:lang w:val="en-US"/>
+        </w:rPr>
+        <w:t xml:space="preserve"> RAI</w:t>
+      </w:r>
+      <w:r>
+        <w:rPr>
+          <w:rFonts w:ascii="Times New Roman" w:eastAsia="Times New Roman" w:hAnsi="Times New Roman" w:cs="Times New Roman"/>
+          <w:sz w:val="22"/>
+          <w:szCs w:val="22"/>
+          <w:highlight w:val="darkYellow"/>
+          <w:lang w:val="en-US"/>
+        </w:rPr>
+        <w:t>”</w:t>
+      </w:r>
+      <w:r>
+        <w:rPr>
+          <w:rFonts w:ascii="Times New Roman" w:eastAsia="Times New Roman" w:hAnsi="Times New Roman" w:cs="Times New Roman"/>
+          <w:sz w:val="22"/>
+          <w:szCs w:val="22"/>
+          <w:highlight w:val="darkYellow"/>
+          <w:lang w:val="en-US"/>
+        </w:rPr>
+        <w:t xml:space="preserve">, </w:t>
+      </w:r>
+      <w:r>
+        <w:rPr>
+          <w:rFonts w:ascii="Times New Roman" w:eastAsia="Times New Roman" w:hAnsi="Times New Roman" w:cs="Times New Roman"/>
+          <w:sz w:val="22"/>
+          <w:szCs w:val="22"/>
+          <w:highlight w:val="darkYellow"/>
+          <w:lang w:val="en-US"/>
+        </w:rPr>
+        <w:t xml:space="preserve">as result of there was to RAI </w:t>
+      </w:r>
+      <w:r>
+        <w:rPr>
+          <w:rFonts w:ascii="Times New Roman" w:eastAsia="Times New Roman" w:hAnsi="Times New Roman" w:cs="Times New Roman"/>
+          <w:sz w:val="22"/>
+          <w:szCs w:val="22"/>
+          <w:highlight w:val="darkYellow"/>
+          <w:lang w:val="en-US"/>
+        </w:rPr>
+        <w:t>== 1 if they were exposed to that</w:t>
+      </w:r>
+      <w:r>
+        <w:rPr>
+          <w:rFonts w:ascii="Times New Roman" w:eastAsia="Times New Roman" w:hAnsi="Times New Roman" w:cs="Times New Roman"/>
+          <w:sz w:val="22"/>
+          <w:szCs w:val="22"/>
+          <w:highlight w:val="darkYellow"/>
+          <w:lang w:val="en-US"/>
+        </w:rPr>
+        <w:t xml:space="preserve">, or even </w:t>
+      </w:r>
+      <w:r>
+        <w:rPr>
+          <w:rFonts w:ascii="Times New Roman" w:eastAsia="Times New Roman" w:hAnsi="Times New Roman" w:cs="Times New Roman"/>
+          <w:sz w:val="22"/>
+          <w:szCs w:val="22"/>
+          <w:highlight w:val="darkYellow"/>
+          <w:lang w:val="en-US"/>
+        </w:rPr>
+        <w:t xml:space="preserve">as </w:t>
+      </w:r>
+      <w:r>
+        <w:rPr>
+          <w:rFonts w:ascii="Times New Roman" w:eastAsia="Times New Roman" w:hAnsi="Times New Roman" w:cs="Times New Roman"/>
+          <w:sz w:val="22"/>
+          <w:szCs w:val="22"/>
+          <w:highlight w:val="darkYellow"/>
+          <w:lang w:val="en-US"/>
+        </w:rPr>
+        <w:t>product</w:t>
+      </w:r>
+      <w:r>
+        <w:rPr>
+          <w:rFonts w:ascii="Times New Roman" w:eastAsia="Times New Roman" w:hAnsi="Times New Roman" w:cs="Times New Roman"/>
+          <w:sz w:val="22"/>
+          <w:szCs w:val="22"/>
+          <w:highlight w:val="darkYellow"/>
+          <w:lang w:val="en-US"/>
+        </w:rPr>
+        <w:t xml:space="preserve"> </w:t>
+      </w:r>
+      <w:r>
+        <w:rPr>
+          <w:rFonts w:ascii="Times New Roman" w:eastAsia="Times New Roman" w:hAnsi="Times New Roman" w:cs="Times New Roman"/>
+          <w:sz w:val="22"/>
+          <w:szCs w:val="22"/>
+          <w:highlight w:val="darkYellow"/>
+          <w:lang w:val="en-US"/>
+        </w:rPr>
+        <w:t xml:space="preserve">of data </w:t>
+      </w:r>
+      <w:r>
+        <w:rPr>
+          <w:rFonts w:ascii="Times New Roman" w:eastAsia="Times New Roman" w:hAnsi="Times New Roman" w:cs="Times New Roman"/>
+          <w:sz w:val="22"/>
+          <w:szCs w:val="22"/>
+          <w:highlight w:val="darkYellow"/>
+          <w:lang w:val="en-US"/>
+        </w:rPr>
+        <w:t>itself</w:t>
+      </w:r>
+      <w:r>
+        <w:rPr>
+          <w:rFonts w:ascii="Times New Roman" w:eastAsia="Times New Roman" w:hAnsi="Times New Roman" w:cs="Times New Roman"/>
+          <w:sz w:val="22"/>
+          <w:szCs w:val="22"/>
+          <w:lang w:val="en-US"/>
+        </w:rPr>
+        <w:t>.</w:t>
+      </w:r>
+    </w:p>
+    <w:p>
+      <w:pPr>
+        <w:jc w:val="both"/>
+        <w:rPr>
+          <w:rFonts w:ascii="Times New Roman" w:eastAsia="Times New Roman" w:hAnsi="Times New Roman" w:cs="Times New Roman"/>
+          <w:sz w:val="22"/>
+          <w:szCs w:val="22"/>
+          <w:lang w:val="en-US"/>
+        </w:rPr>
+      </w:pPr>
+    </w:p>
+    <w:p>
+      <w:pPr>
+        <w:jc w:val="both"/>
+        <w:rPr>
+          <w:rFonts w:ascii="Times New Roman" w:eastAsia="Times New Roman" w:hAnsi="Times New Roman" w:cs="Times New Roman"/>
+          <w:sz w:val="22"/>
+          <w:szCs w:val="22"/>
+          <w:lang w:val="en-US"/>
+        </w:rPr>
+      </w:pPr>
+    </w:p>
+    <w:p>
+      <w:pPr>
+        <w:jc w:val="both"/>
+        <w:rPr>
+          <w:rFonts w:ascii="Times New Roman" w:eastAsia="Times New Roman" w:hAnsi="Times New Roman" w:cs="Times New Roman"/>
+          <w:sz w:val="22"/>
+          <w:szCs w:val="22"/>
+          <w:lang w:val="en-US"/>
+        </w:rPr>
+      </w:pPr>
+    </w:p>
+    <w:p>
+      <w:pPr>
+        <w:jc w:val="both"/>
+        <w:rPr>
+          <w:rFonts w:ascii="Times New Roman" w:eastAsia="Times New Roman" w:hAnsi="Times New Roman" w:cs="Times New Roman"/>
+          <w:sz w:val="22"/>
+          <w:szCs w:val="22"/>
+          <w:lang w:val="en-US"/>
+        </w:rPr>
+      </w:pPr>
+      <w:r>
+        <w:rPr>
+          <w:rFonts w:ascii="Times New Roman" w:eastAsia="Times New Roman" w:hAnsi="Times New Roman" w:cs="Times New Roman"/>
+          <w:sz w:val="22"/>
+          <w:szCs w:val="22"/>
           <w:lang w:val="en-US"/>
         </w:rPr>
         <w:t>All datasets are pre-existing, well</w:t>
@@ -2263,7 +2569,7 @@
     </w:p>
     <w:p>
       <w:pPr>
-        <w:pStyle w:val="Prrafodelista"/>
+        <w:pStyle w:val="ListParagraph"/>
         <w:numPr>
           <w:ilvl w:val="0"/>
           <w:numId w:val="10"/>
@@ -2341,7 +2647,7 @@
       </w:pPr>
       <w:r>
         <w:rPr>
-          <w:rStyle w:val="Textoennegrita"/>
+          <w:rStyle w:val="Strong"/>
           <w:i/>
           <w:sz w:val="22"/>
           <w:szCs w:val="22"/>
@@ -2409,13 +2715,36 @@
       </w:pPr>
       <w:r>
         <w:rPr>
-          <w:rStyle w:val="Textoennegrita"/>
+          <w:rStyle w:val="Strong"/>
           <w:i/>
           <w:sz w:val="22"/>
           <w:szCs w:val="22"/>
           <w:lang w:val="en-US"/>
         </w:rPr>
-        <w:t>Tumor and pathologic characteristics</w:t>
+        <w:lastRenderedPageBreak/>
+        <w:t xml:space="preserve">Tumor and </w:t>
+      </w:r>
+      <w:proofErr w:type="gramStart"/>
+      <w:r>
+        <w:rPr>
+          <w:rStyle w:val="Strong"/>
+          <w:i/>
+          <w:sz w:val="22"/>
+          <w:szCs w:val="22"/>
+          <w:lang w:val="en-US"/>
+        </w:rPr>
+        <w:t>pathologic</w:t>
+      </w:r>
+      <w:proofErr w:type="gramEnd"/>
+      <w:r>
+        <w:rPr>
+          <w:rStyle w:val="Strong"/>
+          <w:i/>
+          <w:sz w:val="22"/>
+          <w:szCs w:val="22"/>
+          <w:lang w:val="en-US"/>
+        </w:rPr>
+        <w:t xml:space="preserve"> characteristics</w:t>
       </w:r>
     </w:p>
     <w:p>
@@ -2544,16 +2873,127 @@
         <w:rPr>
           <w:sz w:val="22"/>
           <w:szCs w:val="22"/>
-          <w:lang w:val="en-US"/>
-        </w:rPr>
-      </w:pPr>
-      <w:r>
-        <w:rPr>
-          <w:sz w:val="22"/>
-          <w:szCs w:val="22"/>
-          <w:lang w:val="en-US"/>
-        </w:rPr>
-        <w:t>Number of positive lymph nodes (continuous)</w:t>
+          <w:highlight w:val="darkYellow"/>
+          <w:lang w:val="en-US"/>
+        </w:rPr>
+      </w:pPr>
+      <w:r>
+        <w:rPr>
+          <w:sz w:val="22"/>
+          <w:szCs w:val="22"/>
+          <w:lang w:val="en-US"/>
+        </w:rPr>
+        <w:t>Number of positive lymph nodes (continuous</w:t>
+      </w:r>
+      <w:r>
+        <w:rPr>
+          <w:sz w:val="22"/>
+          <w:szCs w:val="22"/>
+          <w:highlight w:val="darkYellow"/>
+          <w:lang w:val="en-US"/>
+        </w:rPr>
+        <w:t>)</w:t>
+      </w:r>
+      <w:r>
+        <w:rPr>
+          <w:sz w:val="22"/>
+          <w:szCs w:val="22"/>
+          <w:highlight w:val="darkYellow"/>
+          <w:lang w:val="en-US"/>
+        </w:rPr>
+        <w:t xml:space="preserve">, </w:t>
+      </w:r>
+      <w:r>
+        <w:rPr>
+          <w:sz w:val="22"/>
+          <w:szCs w:val="22"/>
+          <w:highlight w:val="darkYellow"/>
+          <w:lang w:val="en-US"/>
+        </w:rPr>
+        <w:t xml:space="preserve">we </w:t>
+      </w:r>
+      <w:r>
+        <w:rPr>
+          <w:sz w:val="22"/>
+          <w:szCs w:val="22"/>
+          <w:highlight w:val="darkYellow"/>
+          <w:lang w:val="en-US"/>
+        </w:rPr>
+        <w:t xml:space="preserve">used </w:t>
+      </w:r>
+      <w:r>
+        <w:rPr>
+          <w:sz w:val="22"/>
+          <w:szCs w:val="22"/>
+          <w:highlight w:val="darkYellow"/>
+          <w:lang w:val="en-US"/>
+        </w:rPr>
+        <w:t>NUMBEROFLYMPHNODEEXCISION</w:t>
+      </w:r>
+      <w:r>
+        <w:rPr>
+          <w:sz w:val="22"/>
+          <w:szCs w:val="22"/>
+          <w:highlight w:val="darkYellow"/>
+          <w:lang w:val="en-US"/>
+        </w:rPr>
+        <w:t xml:space="preserve"> </w:t>
+      </w:r>
+      <w:r>
+        <w:rPr>
+          <w:sz w:val="22"/>
+          <w:szCs w:val="22"/>
+          <w:highlight w:val="darkYellow"/>
+          <w:lang w:val="en-US"/>
+        </w:rPr>
+        <w:t xml:space="preserve">to determine if it was </w:t>
+      </w:r>
+      <w:r>
+        <w:rPr>
+          <w:sz w:val="22"/>
+          <w:szCs w:val="22"/>
+          <w:highlight w:val="darkYellow"/>
+          <w:lang w:val="en-US"/>
+        </w:rPr>
+        <w:t>0 the following variables "POSITIVELYMPHNODEN1", "NUMBEROFPOSITIVELYMPHNODEEXCISION", "LN RATIO", "</w:t>
+      </w:r>
+      <w:proofErr w:type="gramStart"/>
+      <w:r>
+        <w:rPr>
+          <w:sz w:val="22"/>
+          <w:szCs w:val="22"/>
+          <w:highlight w:val="darkYellow"/>
+          <w:lang w:val="en-US"/>
+        </w:rPr>
+        <w:t>SIZEOFPOSITIVELYMPHNODE(</w:t>
+      </w:r>
+      <w:proofErr w:type="gramEnd"/>
+      <w:r>
+        <w:rPr>
+          <w:sz w:val="22"/>
+          <w:szCs w:val="22"/>
+          <w:highlight w:val="darkYellow"/>
+          <w:lang w:val="en-US"/>
+        </w:rPr>
+        <w:t xml:space="preserve">cm)", "NUMBEROFLYMPHNODEEXCISION" </w:t>
+      </w:r>
+      <w:r>
+        <w:rPr>
+          <w:sz w:val="22"/>
+          <w:szCs w:val="22"/>
+          <w:highlight w:val="darkYellow"/>
+          <w:lang w:val="en-US"/>
+        </w:rPr>
+        <w:t>will be 0, too</w:t>
+      </w:r>
+      <w:r>
+        <w:rPr>
+          <w:sz w:val="22"/>
+          <w:szCs w:val="22"/>
+          <w:highlight w:val="darkYellow"/>
+          <w:lang w:val="en-US"/>
+        </w:rPr>
+        <w:t>.</w:t>
       </w:r>
     </w:p>
     <w:p>
@@ -2599,7 +3039,6 @@
           <w:szCs w:val="22"/>
           <w:lang w:val="en-US"/>
         </w:rPr>
-        <w:lastRenderedPageBreak/>
         <w:t>Lymph node ratio (continuous)</w:t>
       </w:r>
     </w:p>
@@ -2617,13 +3056,23 @@
           <w:lang w:val="en-US"/>
         </w:rPr>
       </w:pPr>
-      <w:r>
-        <w:rPr>
-          <w:sz w:val="22"/>
-          <w:szCs w:val="22"/>
-          <w:lang w:val="en-US"/>
-        </w:rPr>
-        <w:t>Histologic subtype (categorical)</w:t>
+      <w:proofErr w:type="gramStart"/>
+      <w:r>
+        <w:rPr>
+          <w:sz w:val="22"/>
+          <w:szCs w:val="22"/>
+          <w:lang w:val="en-US"/>
+        </w:rPr>
+        <w:t>Histologic</w:t>
+      </w:r>
+      <w:proofErr w:type="gramEnd"/>
+      <w:r>
+        <w:rPr>
+          <w:sz w:val="22"/>
+          <w:szCs w:val="22"/>
+          <w:lang w:val="en-US"/>
+        </w:rPr>
+        <w:t xml:space="preserve"> subtype (categorical)</w:t>
       </w:r>
     </w:p>
     <w:p>
@@ -2639,7 +3088,7 @@
       </w:pPr>
       <w:r>
         <w:rPr>
-          <w:rStyle w:val="Textoennegrita"/>
+          <w:rStyle w:val="Strong"/>
           <w:i/>
           <w:sz w:val="22"/>
           <w:szCs w:val="22"/>
@@ -2684,7 +3133,7 @@
       </w:pPr>
       <w:r>
         <w:rPr>
-          <w:rStyle w:val="Textoennegrita"/>
+          <w:rStyle w:val="Strong"/>
           <w:i/>
           <w:sz w:val="22"/>
           <w:szCs w:val="22"/>
@@ -2729,7 +3178,7 @@
       </w:pPr>
       <w:r>
         <w:rPr>
-          <w:rStyle w:val="Textoennegrita"/>
+          <w:rStyle w:val="Strong"/>
           <w:i/>
           <w:sz w:val="22"/>
           <w:szCs w:val="22"/>
@@ -2786,7 +3235,7 @@
     </w:p>
     <w:p>
       <w:pPr>
-        <w:pStyle w:val="Prrafodelista"/>
+        <w:pStyle w:val="ListParagraph"/>
         <w:numPr>
           <w:ilvl w:val="0"/>
           <w:numId w:val="10"/>
@@ -2910,7 +3359,6 @@
             <w:docPart w:val="DefaultPlaceholder_-1854013440"/>
           </w:placeholder>
         </w:sdtPr>
-        <w:sdtEndPr/>
         <w:sdtContent>
           <w:r>
             <w:rPr>
@@ -2932,7 +3380,35 @@
           <w:szCs w:val="22"/>
           <w:lang w:val="en-US"/>
         </w:rPr>
-        <w:t xml:space="preserve"> recommendations for prediction modeling using structured clinical data. Based on prior systematic reviews and the expected sample size, tree-based machine learning algorithms</w:t>
+        <w:t xml:space="preserve"> recommendations for prediction modeling using structured clinical data. Based on prior systematic reviews and the expected sample size, </w:t>
+      </w:r>
+      <w:r>
+        <w:rPr>
+          <w:rFonts w:ascii="Times New Roman" w:eastAsia="Times New Roman" w:hAnsi="Times New Roman" w:cs="Times New Roman"/>
+          <w:sz w:val="22"/>
+          <w:szCs w:val="22"/>
+          <w:highlight w:val="darkYellow"/>
+          <w:lang w:val="en-US"/>
+        </w:rPr>
+        <w:t>logistic regression</w:t>
+      </w:r>
+      <w:r>
+        <w:rPr>
+          <w:rFonts w:ascii="Times New Roman" w:eastAsia="Times New Roman" w:hAnsi="Times New Roman" w:cs="Times New Roman"/>
+          <w:sz w:val="22"/>
+          <w:szCs w:val="22"/>
+          <w:lang w:val="en-US"/>
+        </w:rPr>
+        <w:t xml:space="preserve">, </w:t>
+      </w:r>
+      <w:r>
+        <w:rPr>
+          <w:rFonts w:ascii="Times New Roman" w:eastAsia="Times New Roman" w:hAnsi="Times New Roman" w:cs="Times New Roman"/>
+          <w:sz w:val="22"/>
+          <w:szCs w:val="22"/>
+          <w:lang w:val="en-US"/>
+        </w:rPr>
+        <w:t>tree-based machine learning algorithms</w:t>
       </w:r>
       <w:r>
         <w:rPr>
@@ -3202,7 +3678,7 @@
     </w:p>
     <w:p>
       <w:pPr>
-        <w:pStyle w:val="Prrafodelista"/>
+        <w:pStyle w:val="ListParagraph"/>
         <w:numPr>
           <w:ilvl w:val="0"/>
           <w:numId w:val="2"/>
@@ -3227,7 +3703,7 @@
     </w:p>
     <w:p>
       <w:pPr>
-        <w:pStyle w:val="Prrafodelista"/>
+        <w:pStyle w:val="ListParagraph"/>
         <w:numPr>
           <w:ilvl w:val="0"/>
           <w:numId w:val="2"/>
@@ -3252,7 +3728,7 @@
     </w:p>
     <w:p>
       <w:pPr>
-        <w:pStyle w:val="Prrafodelista"/>
+        <w:pStyle w:val="ListParagraph"/>
         <w:numPr>
           <w:ilvl w:val="0"/>
           <w:numId w:val="2"/>
@@ -3352,7 +3828,7 @@
     </w:p>
     <w:p>
       <w:pPr>
-        <w:pStyle w:val="Prrafodelista"/>
+        <w:pStyle w:val="ListParagraph"/>
         <w:numPr>
           <w:ilvl w:val="0"/>
           <w:numId w:val="10"/>
@@ -3455,6 +3931,7 @@
           <w:szCs w:val="22"/>
           <w:lang w:val="en-US"/>
         </w:rPr>
+        <w:lastRenderedPageBreak/>
         <w:t>External validation will be conducted in large, independent U.S. cohorts from the Mayo Clinic and Memorial Sloan Kettering Cancer Center, comprising approximately 8,000 patients overall. This sample size substantially exceeds contemporary recommendations for robust external validation and provides high statistical precision for performance estimates. Validation will strictly follow TRIPOD-AI</w:t>
       </w:r>
       <w:sdt>
@@ -3473,7 +3950,6 @@
             <w:docPart w:val="DefaultPlaceholder_-1854013440"/>
           </w:placeholder>
         </w:sdtPr>
-        <w:sdtEndPr/>
         <w:sdtContent>
           <w:r>
             <w:rPr>
@@ -3568,17 +4044,7 @@
           <w:szCs w:val="22"/>
           <w:lang w:val="en-US"/>
         </w:rPr>
-        <w:t xml:space="preserve">Model transportability will be formally evaluated by comparing baseline recurrence rates, predictor distributions, discrimination, and calibration between the development and validation cohorts. Particular emphasis will be placed on </w:t>
-      </w:r>
-      <w:r>
-        <w:rPr>
-          <w:rFonts w:ascii="Times New Roman" w:eastAsia="Times New Roman" w:hAnsi="Times New Roman" w:cs="Times New Roman"/>
-          <w:sz w:val="22"/>
-          <w:szCs w:val="22"/>
-          <w:lang w:val="en-US"/>
-        </w:rPr>
-        <w:lastRenderedPageBreak/>
-        <w:t>calibration-in-the-large and calibration slope, as accurate calibration is essential for safe clinical decision-making and guideline implementation</w:t>
+        <w:t>Model transportability will be formally evaluated by comparing baseline recurrence rates, predictor distributions, discrimination, and calibration between the development and validation cohorts. Particular emphasis will be placed on calibration-in-the-large and calibration slope, as accurate calibration is essential for safe clinical decision-making and guideline implementation</w:t>
       </w:r>
       <w:r>
         <w:rPr>
@@ -3762,7 +4228,6 @@
             <w:docPart w:val="DefaultPlaceholder_-1854013440"/>
           </w:placeholder>
         </w:sdtPr>
-        <w:sdtEndPr/>
         <w:sdtContent>
           <w:r>
             <w:rPr>
@@ -3849,7 +4314,7 @@
     </w:p>
     <w:p>
       <w:pPr>
-        <w:pStyle w:val="Prrafodelista"/>
+        <w:pStyle w:val="ListParagraph"/>
         <w:numPr>
           <w:ilvl w:val="0"/>
           <w:numId w:val="10"/>
@@ -4019,10 +4484,18 @@
           <w:szCs w:val="22"/>
           <w:lang w:val="en-US"/>
         </w:rPr>
-        <w:t>To address this, two complementary specifications will be developed: a treatment-conditional model incorporating surgical extent and RAI dose to estimate post-treatment recurrence risk, and a pretreatment model excluding therapeutic variables to estimate baseline risk before clinical decision-making. Model performance will be compared in terms of discrimination (AUC), calibration (intercept and slope), and clinical utility (decision curve analysis) to determine whether inclusion of treatment variables provides meaningful incremental predictive value while preserving transportability.</w:t>
-      </w:r>
-      <w:bookmarkStart w:id="0" w:name="_GoBack"/>
-      <w:bookmarkEnd w:id="0"/>
+        <w:t xml:space="preserve">To address this, two complementary specifications will be developed: a treatment-conditional model incorporating surgical extent and RAI dose to estimate post-treatment recurrence risk, and a pretreatment model excluding therapeutic variables to estimate baseline risk before clinical decision-making. Model performance will be compared in terms of discrimination (AUC), calibration (intercept and slope), and clinical utility (decision curve analysis) to determine </w:t>
+      </w:r>
+      <w:r>
+        <w:rPr>
+          <w:rFonts w:ascii="Times New Roman" w:eastAsia="Times New Roman" w:hAnsi="Times New Roman" w:cs="Times New Roman"/>
+          <w:sz w:val="22"/>
+          <w:szCs w:val="22"/>
+          <w:lang w:val="en-US"/>
+        </w:rPr>
+        <w:lastRenderedPageBreak/>
+        <w:t>whether inclusion of treatment variables provides meaningful incremental predictive value while preserving transportability.</w:t>
+      </w:r>
     </w:p>
     <w:p>
       <w:pPr>
@@ -4037,14 +4510,14 @@
     </w:p>
     <w:p>
       <w:pPr>
-        <w:pStyle w:val="Prrafodelista"/>
+        <w:pStyle w:val="ListParagraph"/>
         <w:numPr>
           <w:ilvl w:val="0"/>
           <w:numId w:val="10"/>
         </w:numPr>
         <w:jc w:val="both"/>
         <w:rPr>
-          <w:rStyle w:val="Textoennegrita"/>
+          <w:rStyle w:val="Strong"/>
           <w:rFonts w:ascii="Times New Roman" w:eastAsia="Times New Roman" w:hAnsi="Times New Roman" w:cs="Times New Roman"/>
           <w:sz w:val="22"/>
           <w:szCs w:val="22"/>
@@ -4089,7 +4562,7 @@
       <w:pPr>
         <w:jc w:val="both"/>
         <w:rPr>
-          <w:rStyle w:val="Textoennegrita"/>
+          <w:rStyle w:val="Strong"/>
           <w:rFonts w:ascii="Times New Roman" w:eastAsia="Times New Roman" w:hAnsi="Times New Roman" w:cs="Times New Roman"/>
           <w:b w:val="0"/>
           <w:bCs w:val="0"/>
@@ -4100,7 +4573,7 @@
       </w:pPr>
       <w:r>
         <w:rPr>
-          <w:rStyle w:val="Textoennegrita"/>
+          <w:rStyle w:val="Strong"/>
           <w:rFonts w:ascii="Times New Roman" w:eastAsia="Times New Roman" w:hAnsi="Times New Roman" w:cs="Times New Roman"/>
           <w:b w:val="0"/>
           <w:bCs w:val="0"/>
@@ -4112,7 +4585,7 @@
       </w:r>
       <w:r>
         <w:rPr>
-          <w:rStyle w:val="Textoennegrita"/>
+          <w:rStyle w:val="Strong"/>
           <w:rFonts w:ascii="Times New Roman" w:eastAsia="Times New Roman" w:hAnsi="Times New Roman" w:cs="Times New Roman"/>
           <w:b w:val="0"/>
           <w:bCs w:val="0"/>
@@ -4124,7 +4597,7 @@
       </w:r>
       <w:r>
         <w:rPr>
-          <w:rStyle w:val="Textoennegrita"/>
+          <w:rStyle w:val="Strong"/>
           <w:rFonts w:ascii="Times New Roman" w:eastAsia="Times New Roman" w:hAnsi="Times New Roman" w:cs="Times New Roman"/>
           <w:b w:val="0"/>
           <w:bCs w:val="0"/>
@@ -4136,7 +4609,7 @@
       </w:r>
       <w:r>
         <w:rPr>
-          <w:rStyle w:val="Textoennegrita"/>
+          <w:rStyle w:val="Strong"/>
           <w:rFonts w:ascii="Times New Roman" w:eastAsia="Times New Roman" w:hAnsi="Times New Roman" w:cs="Times New Roman"/>
           <w:b w:val="0"/>
           <w:bCs w:val="0"/>
@@ -4151,7 +4624,7 @@
       <w:pPr>
         <w:jc w:val="both"/>
         <w:rPr>
-          <w:rStyle w:val="Textoennegrita"/>
+          <w:rStyle w:val="Strong"/>
           <w:rFonts w:ascii="Times New Roman" w:eastAsia="Times New Roman" w:hAnsi="Times New Roman" w:cs="Times New Roman"/>
           <w:b w:val="0"/>
           <w:bCs w:val="0"/>
@@ -4173,7 +4646,7 @@
       </w:pPr>
       <w:r>
         <w:rPr>
-          <w:rStyle w:val="Textoennegrita"/>
+          <w:rStyle w:val="Strong"/>
           <w:rFonts w:ascii="Times New Roman" w:eastAsia="Times New Roman" w:hAnsi="Times New Roman" w:cs="Times New Roman"/>
           <w:b w:val="0"/>
           <w:bCs w:val="0"/>
@@ -4185,7 +4658,7 @@
       </w:r>
       <w:r>
         <w:rPr>
-          <w:rStyle w:val="Textoennegrita"/>
+          <w:rStyle w:val="Strong"/>
           <w:rFonts w:ascii="Times New Roman" w:eastAsia="Times New Roman" w:hAnsi="Times New Roman" w:cs="Times New Roman"/>
           <w:b w:val="0"/>
           <w:bCs w:val="0"/>
@@ -4197,7 +4670,7 @@
       </w:r>
       <w:r>
         <w:rPr>
-          <w:rStyle w:val="Textoennegrita"/>
+          <w:rStyle w:val="Strong"/>
           <w:rFonts w:ascii="Times New Roman" w:eastAsia="Times New Roman" w:hAnsi="Times New Roman" w:cs="Times New Roman"/>
           <w:b w:val="0"/>
           <w:bCs w:val="0"/>
@@ -4209,7 +4682,7 @@
       </w:r>
       <w:r>
         <w:rPr>
-          <w:rStyle w:val="Textoennegrita"/>
+          <w:rStyle w:val="Strong"/>
           <w:rFonts w:ascii="Times New Roman" w:eastAsia="Times New Roman" w:hAnsi="Times New Roman" w:cs="Times New Roman"/>
           <w:b w:val="0"/>
           <w:bCs w:val="0"/>
@@ -4221,7 +4694,7 @@
       </w:r>
       <w:r>
         <w:rPr>
-          <w:rStyle w:val="Textoennegrita"/>
+          <w:rStyle w:val="Strong"/>
           <w:rFonts w:ascii="Times New Roman" w:eastAsia="Times New Roman" w:hAnsi="Times New Roman" w:cs="Times New Roman"/>
           <w:b w:val="0"/>
           <w:bCs w:val="0"/>
@@ -4233,7 +4706,7 @@
       </w:r>
       <w:r>
         <w:rPr>
-          <w:rStyle w:val="Textoennegrita"/>
+          <w:rStyle w:val="Strong"/>
           <w:rFonts w:ascii="Times New Roman" w:eastAsia="Times New Roman" w:hAnsi="Times New Roman" w:cs="Times New Roman"/>
           <w:b w:val="0"/>
           <w:bCs w:val="0"/>
@@ -4245,7 +4718,7 @@
       </w:r>
       <w:r>
         <w:rPr>
-          <w:rStyle w:val="Textoennegrita"/>
+          <w:rStyle w:val="Strong"/>
           <w:rFonts w:ascii="Times New Roman" w:eastAsia="Times New Roman" w:hAnsi="Times New Roman" w:cs="Times New Roman"/>
           <w:b w:val="0"/>
           <w:bCs w:val="0"/>
@@ -4253,20 +4726,7 @@
           <w:szCs w:val="22"/>
           <w:lang w:val="en-US"/>
         </w:rPr>
-        <w:t xml:space="preserve">for the development, external validation, and cross-population implementation of AI-based prediction models in thyroid oncology. By addressing transportability and calibration across diverse </w:t>
-      </w:r>
-      <w:r>
-        <w:rPr>
-          <w:rStyle w:val="Textoennegrita"/>
-          <w:rFonts w:ascii="Times New Roman" w:eastAsia="Times New Roman" w:hAnsi="Times New Roman" w:cs="Times New Roman"/>
-          <w:b w:val="0"/>
-          <w:bCs w:val="0"/>
-          <w:sz w:val="22"/>
-          <w:szCs w:val="22"/>
-          <w:lang w:val="en-US"/>
-        </w:rPr>
-        <w:lastRenderedPageBreak/>
-        <w:t xml:space="preserve">healthcare systems, the project aims to advance precision risk stratification and support evidence-based personalization of postoperative management in patients with DTC. </w:t>
+        <w:t xml:space="preserve">for the development, external validation, and cross-population implementation of AI-based prediction models in thyroid oncology. By addressing transportability and calibration across diverse healthcare systems, the project aims to advance precision risk stratification and support evidence-based personalization of postoperative management in patients with DTC. </w:t>
       </w:r>
     </w:p>
     <w:p>
@@ -4282,7 +4742,7 @@
     </w:p>
     <w:p>
       <w:pPr>
-        <w:pStyle w:val="Prrafodelista"/>
+        <w:pStyle w:val="ListParagraph"/>
         <w:numPr>
           <w:ilvl w:val="0"/>
           <w:numId w:val="10"/>
@@ -4324,7 +4784,7 @@
           <w:szCs w:val="22"/>
           <w:lang w:val="en-US"/>
         </w:rPr>
-        <w:t xml:space="preserve">All analyses will be conducted using open-source, reproducible software environments. Statistical modeling and data preprocessing will be performed primarily in Python (version ≥3.10). Machine learning models will be developed using the </w:t>
+        <w:t xml:space="preserve">All analyses will be conducted using open-source, reproducible software environments. Statistical modeling and data preprocessing will be performed primarily in Python (version ≥3.10). Machine learning models will be developed using the scikit-learn library, which provides validated implementations of algorithms suitable for structured clinical data, including Random Forest and gradient-boosted trees (e.g., </w:t>
       </w:r>
       <w:proofErr w:type="spellStart"/>
       <w:r>
@@ -4333,7 +4793,7 @@
           <w:szCs w:val="22"/>
           <w:lang w:val="en-US"/>
         </w:rPr>
-        <w:t>scikit</w:t>
+        <w:t>XGBoost</w:t>
       </w:r>
       <w:proofErr w:type="spellEnd"/>
       <w:r>
@@ -4342,43 +4802,7 @@
           <w:szCs w:val="22"/>
           <w:lang w:val="en-US"/>
         </w:rPr>
-        <w:t xml:space="preserve">-learn library, which provides validated implementations of algorithms suitable for structured clinical data, including Random Forest and gradient-boosted trees (e.g., </w:t>
-      </w:r>
-      <w:proofErr w:type="spellStart"/>
-      <w:r>
-        <w:rPr>
-          <w:sz w:val="22"/>
-          <w:szCs w:val="22"/>
-          <w:lang w:val="en-US"/>
-        </w:rPr>
-        <w:t>XGBoost</w:t>
-      </w:r>
-      <w:proofErr w:type="spellEnd"/>
-      <w:r>
-        <w:rPr>
-          <w:sz w:val="22"/>
-          <w:szCs w:val="22"/>
-          <w:lang w:val="en-US"/>
-        </w:rPr>
-        <w:t xml:space="preserve">). Supporting libraries such as pandas and NumPy will be used for data management and numerical computation, while SciPy will support statistical procedures. Model performance metrics, including discrimination (AUC), calibration measures, and other evaluation statistics, will be computed using </w:t>
-      </w:r>
-      <w:proofErr w:type="spellStart"/>
-      <w:r>
-        <w:rPr>
-          <w:sz w:val="22"/>
-          <w:szCs w:val="22"/>
-          <w:lang w:val="en-US"/>
-        </w:rPr>
-        <w:t>scikit</w:t>
-      </w:r>
-      <w:proofErr w:type="spellEnd"/>
-      <w:r>
-        <w:rPr>
-          <w:sz w:val="22"/>
-          <w:szCs w:val="22"/>
-          <w:lang w:val="en-US"/>
-        </w:rPr>
-        <w:t>-learn and related packages.</w:t>
+        <w:t>). Supporting libraries such as pandas and NumPy will be used for data management and numerical computation, while SciPy will support statistical procedures. Model performance metrics, including discrimination (AUC), calibration measures, and other evaluation statistics, will be computed using scikit-learn and related packages.</w:t>
       </w:r>
     </w:p>
     <w:p>
@@ -4446,7 +4870,25 @@
           <w:szCs w:val="22"/>
           <w:lang w:val="en-US"/>
         </w:rPr>
-        <w:t>Data quality and completeness: Missing data, inconsistent documentation, or variable data granularity across centers may compromise model development and validation. Standardized data collection templates, rigorous data cleaning procedures, multiple imputation, and predefined quality control checks will be implemented.</w:t>
+        <w:t xml:space="preserve">Data quality and completeness: Missing data, inconsistent documentation, or variable data granularity across centers may compromise model development and validation. Standardized data collection templates, rigorous data cleaning procedures, multiple </w:t>
+      </w:r>
+      <w:proofErr w:type="gramStart"/>
+      <w:r>
+        <w:rPr>
+          <w:sz w:val="22"/>
+          <w:szCs w:val="22"/>
+          <w:lang w:val="en-US"/>
+        </w:rPr>
+        <w:t>imputation</w:t>
+      </w:r>
+      <w:proofErr w:type="gramEnd"/>
+      <w:r>
+        <w:rPr>
+          <w:sz w:val="22"/>
+          <w:szCs w:val="22"/>
+          <w:lang w:val="en-US"/>
+        </w:rPr>
+        <w:t>, and predefined quality control checks will be implemented.</w:t>
       </w:r>
     </w:p>
     <w:p>
@@ -4610,7 +5052,16 @@
           <w:szCs w:val="22"/>
           <w:lang w:val="en"/>
         </w:rPr>
-        <w:t xml:space="preserve"> promoter mutations) provide valuable prognostic information for DTC recurrence, routine molecular testing is not uniformly performed across all participating sites, particularly within the multinational Latin American development cohort. Mandating these variables would introduce substantial missing data and limit the model's real-world utility in resource-constrained settings. By purposefully restricting candidate predictors to universally available clinicopathologic and biochemical data, we maximize the model's global transportability. However, we will perform an exploratory sensitivity analysis within the U.S. validation cohorts, where molecular data may be more routinely captured, to assess the incremental predictive value of these markers when added to our baseline AI models.</w:t>
+        <w:t xml:space="preserve"> promoter mutations) provide valuable prognostic information for DTC recurrence, routine molecular testing is not uniformly performed across all participating sites, particularly within the multinational Latin American development cohort. Mandating these variables would introduce substantial missing data and limit the model's real-world utility in resource-constrained settings. By purposefully restricting candidate predictors to universally available clinicopathologic and biochemical data, we maximize the model's global transportability. However, we will perform an exploratory sensitivity analysis within the U.S. validation cohorts, where molecular data </w:t>
+      </w:r>
+      <w:r>
+        <w:rPr>
+          <w:sz w:val="22"/>
+          <w:szCs w:val="22"/>
+          <w:lang w:val="en"/>
+        </w:rPr>
+        <w:lastRenderedPageBreak/>
+        <w:t>may be more routinely captured, to assess the incremental predictive value of these markers when added to our baseline AI models.</w:t>
       </w:r>
     </w:p>
     <w:p>
@@ -4648,7 +5099,7 @@
     </w:p>
     <w:tbl>
       <w:tblPr>
-        <w:tblStyle w:val="Tablaconcuadrcula"/>
+        <w:tblStyle w:val="TableGrid"/>
         <w:tblW w:w="0" w:type="auto"/>
         <w:tblLook w:val="04A0" w:firstRow="1" w:lastRow="0" w:firstColumn="1" w:lastColumn="0" w:noHBand="0" w:noVBand="1"/>
       </w:tblPr>
@@ -5609,8 +6060,18 @@
                 <w:szCs w:val="22"/>
                 <w:lang w:val="en-US"/>
               </w:rPr>
-              <w:lastRenderedPageBreak/>
-              <w:t xml:space="preserve">Aim 2: </w:t>
+              <w:t>Aim 2</w:t>
+            </w:r>
+            <w:proofErr w:type="gramStart"/>
+            <w:r>
+              <w:rPr>
+                <w:rFonts w:ascii="Times New Roman" w:eastAsia="Times New Roman" w:hAnsi="Times New Roman" w:cs="Times New Roman"/>
+                <w:b/>
+                <w:sz w:val="22"/>
+                <w:szCs w:val="22"/>
+                <w:lang w:val="en-US"/>
+              </w:rPr>
+              <w:t xml:space="preserve">: </w:t>
             </w:r>
             <w:r>
               <w:rPr>
@@ -5629,7 +6090,18 @@
                 <w:szCs w:val="22"/>
                 <w:lang w:val="en-US"/>
               </w:rPr>
-              <w:t>External validation, model updating, transportability optimization, and transparent dissemination</w:t>
+              <w:t>External</w:t>
+            </w:r>
+            <w:proofErr w:type="gramEnd"/>
+            <w:r>
+              <w:rPr>
+                <w:rFonts w:ascii="Times New Roman" w:eastAsia="Times New Roman" w:hAnsi="Times New Roman" w:cs="Times New Roman"/>
+                <w:b/>
+                <w:sz w:val="22"/>
+                <w:szCs w:val="22"/>
+                <w:lang w:val="en-US"/>
+              </w:rPr>
+              <w:t xml:space="preserve"> validation, model updating, transportability optimization, and transparent dissemination</w:t>
             </w:r>
           </w:p>
         </w:tc>
@@ -6239,8 +6711,8 @@
           <w:lang w:val="en-US"/>
         </w:rPr>
       </w:pPr>
-      <w:bookmarkStart w:id="1" w:name="_heading=h.4283wuqg5ww" w:colFirst="0" w:colLast="0"/>
-      <w:bookmarkEnd w:id="1"/>
+      <w:bookmarkStart w:id="0" w:name="_heading=h.4283wuqg5ww" w:colFirst="0" w:colLast="0"/>
+      <w:bookmarkEnd w:id="0"/>
     </w:p>
     <w:sdt>
       <w:sdtPr>
@@ -6257,7 +6729,6 @@
           <w:docPart w:val="DefaultPlaceholder_-1854013440"/>
         </w:placeholder>
       </w:sdtPr>
-      <w:sdtEndPr/>
       <w:sdtContent>
         <w:p>
           <w:pPr>
@@ -6286,25 +6757,25 @@
               <w:sz w:val="22"/>
             </w:rPr>
             <w:tab/>
-            <w:t xml:space="preserve">as C, </w:t>
-          </w:r>
-          <w:proofErr w:type="spellStart"/>
-          <w:r>
-            <w:rPr>
-              <w:rFonts w:ascii="Times New Roman" w:eastAsia="Times New Roman" w:hAnsi="Times New Roman" w:cs="Times New Roman"/>
-              <w:color w:val="000000"/>
-              <w:sz w:val="22"/>
-            </w:rPr>
-            <w:t>Jin</w:t>
-          </w:r>
-          <w:proofErr w:type="spellEnd"/>
-          <w:r>
-            <w:rPr>
-              <w:rFonts w:ascii="Times New Roman" w:eastAsia="Times New Roman" w:hAnsi="Times New Roman" w:cs="Times New Roman"/>
-              <w:color w:val="000000"/>
-              <w:sz w:val="22"/>
-            </w:rPr>
-            <w:t xml:space="preserve"> Q, Wu J, et al. Global landscape of early-onset thyroid cancer: current burden, temporal trend and future projections on the basis of GLOBOCAN 2022. </w:t>
+            <w:t xml:space="preserve">as C, Jin Q, Wu J, et al. Global landscape of early-onset thyroid cancer: current burden, temporal trend and future projections </w:t>
+          </w:r>
+          <w:proofErr w:type="gramStart"/>
+          <w:r>
+            <w:rPr>
+              <w:rFonts w:ascii="Times New Roman" w:eastAsia="Times New Roman" w:hAnsi="Times New Roman" w:cs="Times New Roman"/>
+              <w:color w:val="000000"/>
+              <w:sz w:val="22"/>
+            </w:rPr>
+            <w:t>on the basis of</w:t>
+          </w:r>
+          <w:proofErr w:type="gramEnd"/>
+          <w:r>
+            <w:rPr>
+              <w:rFonts w:ascii="Times New Roman" w:eastAsia="Times New Roman" w:hAnsi="Times New Roman" w:cs="Times New Roman"/>
+              <w:color w:val="000000"/>
+              <w:sz w:val="22"/>
+            </w:rPr>
+            <w:t xml:space="preserve"> GLOBOCAN 2022. </w:t>
           </w:r>
           <w:proofErr w:type="gramStart"/>
           <w:r>
@@ -6352,43 +6823,7 @@
               <w:sz w:val="22"/>
             </w:rPr>
             <w:tab/>
-            <w:t xml:space="preserve">Ito Y, </w:t>
-          </w:r>
-          <w:proofErr w:type="spellStart"/>
-          <w:r>
-            <w:rPr>
-              <w:rFonts w:ascii="Times New Roman" w:eastAsia="Times New Roman" w:hAnsi="Times New Roman" w:cs="Times New Roman"/>
-              <w:color w:val="000000"/>
-              <w:sz w:val="22"/>
-            </w:rPr>
-            <w:t>Miyauchi</w:t>
-          </w:r>
-          <w:proofErr w:type="spellEnd"/>
-          <w:r>
-            <w:rPr>
-              <w:rFonts w:ascii="Times New Roman" w:eastAsia="Times New Roman" w:hAnsi="Times New Roman" w:cs="Times New Roman"/>
-              <w:color w:val="000000"/>
-              <w:sz w:val="22"/>
-            </w:rPr>
-            <w:t xml:space="preserve"> A, </w:t>
-          </w:r>
-          <w:proofErr w:type="spellStart"/>
-          <w:r>
-            <w:rPr>
-              <w:rFonts w:ascii="Times New Roman" w:eastAsia="Times New Roman" w:hAnsi="Times New Roman" w:cs="Times New Roman"/>
-              <w:color w:val="000000"/>
-              <w:sz w:val="22"/>
-            </w:rPr>
-            <w:t>Kihara</w:t>
-          </w:r>
-          <w:proofErr w:type="spellEnd"/>
-          <w:r>
-            <w:rPr>
-              <w:rFonts w:ascii="Times New Roman" w:eastAsia="Times New Roman" w:hAnsi="Times New Roman" w:cs="Times New Roman"/>
-              <w:color w:val="000000"/>
-              <w:sz w:val="22"/>
-            </w:rPr>
-            <w:t xml:space="preserve"> M, Fukushima M, Higashiyama T, Miya A. Overall Survival of Papillary Thyroid Carcinoma Patients: A Single-Institution Long-Term Follow-Up of 5897 Patients. </w:t>
+            <w:t xml:space="preserve">Ito Y, Miyauchi A, Kihara M, Fukushima M, Higashiyama T, Miya A. Overall Survival of Papillary Thyroid Carcinoma Patients: A Single-Institution Long-Term Follow-Up of 5897 Patients. </w:t>
           </w:r>
           <w:r>
             <w:rPr>
@@ -6436,24 +6871,7 @@
               <w:sz w:val="22"/>
             </w:rPr>
             <w:tab/>
-          </w:r>
-          <w:proofErr w:type="spellStart"/>
-          <w:r>
-            <w:rPr>
-              <w:rFonts w:ascii="Times New Roman" w:eastAsia="Times New Roman" w:hAnsi="Times New Roman" w:cs="Times New Roman"/>
-              <w:color w:val="000000"/>
-              <w:sz w:val="22"/>
-            </w:rPr>
-            <w:t>Ringel</w:t>
-          </w:r>
-          <w:proofErr w:type="spellEnd"/>
-          <w:r>
-            <w:rPr>
-              <w:rFonts w:ascii="Times New Roman" w:eastAsia="Times New Roman" w:hAnsi="Times New Roman" w:cs="Times New Roman"/>
-              <w:color w:val="000000"/>
-              <w:sz w:val="22"/>
-            </w:rPr>
-            <w:t xml:space="preserve"> MD, Sosa JA, Baloch Z, et al. 2025 American Thyroid Association Management Guidelines for Adult Patients with Differentiated Thyroid Cancer. </w:t>
+            <w:t xml:space="preserve">Ringel MD, Sosa JA, Baloch Z, et al. 2025 American Thyroid Association Management Guidelines for Adult Patients with Differentiated Thyroid Cancer. </w:t>
           </w:r>
           <w:r>
             <w:rPr>
@@ -6615,7 +7033,6 @@
             </w:rPr>
             <w:t xml:space="preserve"> P. Explaining Risk Stratification in Differentiated Thyroid Cancer Using SHAP and Machine Learning Approaches. </w:t>
           </w:r>
-          <w:proofErr w:type="spellStart"/>
           <w:r>
             <w:rPr>
               <w:rFonts w:ascii="Times New Roman" w:eastAsia="Times New Roman" w:hAnsi="Times New Roman" w:cs="Times New Roman"/>
@@ -6627,7 +7044,6 @@
             </w:rPr>
             <w:t>Biomedicines</w:t>
           </w:r>
-          <w:proofErr w:type="spellEnd"/>
           <w:r>
             <w:rPr>
               <w:rFonts w:ascii="Times New Roman" w:eastAsia="Times New Roman" w:hAnsi="Times New Roman" w:cs="Times New Roman"/>
@@ -6667,66 +7083,7 @@
               <w:lang w:val="pt-BR"/>
             </w:rPr>
             <w:tab/>
-          </w:r>
-          <w:proofErr w:type="spellStart"/>
-          <w:r>
-            <w:rPr>
-              <w:rFonts w:ascii="Times New Roman" w:eastAsia="Times New Roman" w:hAnsi="Times New Roman" w:cs="Times New Roman"/>
-              <w:color w:val="000000"/>
-              <w:sz w:val="22"/>
-              <w:lang w:val="pt-BR"/>
-            </w:rPr>
-            <w:t>Ramchandani</w:t>
-          </w:r>
-          <w:proofErr w:type="spellEnd"/>
-          <w:r>
-            <w:rPr>
-              <w:rFonts w:ascii="Times New Roman" w:eastAsia="Times New Roman" w:hAnsi="Times New Roman" w:cs="Times New Roman"/>
-              <w:color w:val="000000"/>
-              <w:sz w:val="22"/>
-              <w:lang w:val="pt-BR"/>
-            </w:rPr>
-            <w:t xml:space="preserve"> R, </w:t>
-          </w:r>
-          <w:proofErr w:type="spellStart"/>
-          <w:r>
-            <w:rPr>
-              <w:rFonts w:ascii="Times New Roman" w:eastAsia="Times New Roman" w:hAnsi="Times New Roman" w:cs="Times New Roman"/>
-              <w:color w:val="000000"/>
-              <w:sz w:val="22"/>
-              <w:lang w:val="pt-BR"/>
-            </w:rPr>
-            <w:t>Guo</w:t>
-          </w:r>
-          <w:proofErr w:type="spellEnd"/>
-          <w:r>
-            <w:rPr>
-              <w:rFonts w:ascii="Times New Roman" w:eastAsia="Times New Roman" w:hAnsi="Times New Roman" w:cs="Times New Roman"/>
-              <w:color w:val="000000"/>
-              <w:sz w:val="22"/>
-              <w:lang w:val="pt-BR"/>
-            </w:rPr>
-            <w:t xml:space="preserve"> E, </w:t>
-          </w:r>
-          <w:proofErr w:type="spellStart"/>
-          <w:r>
-            <w:rPr>
-              <w:rFonts w:ascii="Times New Roman" w:eastAsia="Times New Roman" w:hAnsi="Times New Roman" w:cs="Times New Roman"/>
-              <w:color w:val="000000"/>
-              <w:sz w:val="22"/>
-              <w:lang w:val="pt-BR"/>
-            </w:rPr>
-            <w:t>Biglou</w:t>
-          </w:r>
-          <w:proofErr w:type="spellEnd"/>
-          <w:r>
-            <w:rPr>
-              <w:rFonts w:ascii="Times New Roman" w:eastAsia="Times New Roman" w:hAnsi="Times New Roman" w:cs="Times New Roman"/>
-              <w:color w:val="000000"/>
-              <w:sz w:val="22"/>
-              <w:lang w:val="pt-BR"/>
-            </w:rPr>
-            <w:t xml:space="preserve"> SG, et al. </w:t>
+            <w:t xml:space="preserve">Ramchandani R, Guo E, Biglou SG, et al. </w:t>
           </w:r>
           <w:r>
             <w:rPr>
@@ -6830,43 +7187,7 @@
               <w:sz w:val="22"/>
             </w:rPr>
             <w:tab/>
-            <w:t xml:space="preserve">Durante C, </w:t>
-          </w:r>
-          <w:proofErr w:type="spellStart"/>
-          <w:r>
-            <w:rPr>
-              <w:rFonts w:ascii="Times New Roman" w:eastAsia="Times New Roman" w:hAnsi="Times New Roman" w:cs="Times New Roman"/>
-              <w:color w:val="000000"/>
-              <w:sz w:val="22"/>
-            </w:rPr>
-            <w:t>Hegedüs</w:t>
-          </w:r>
-          <w:proofErr w:type="spellEnd"/>
-          <w:r>
-            <w:rPr>
-              <w:rFonts w:ascii="Times New Roman" w:eastAsia="Times New Roman" w:hAnsi="Times New Roman" w:cs="Times New Roman"/>
-              <w:color w:val="000000"/>
-              <w:sz w:val="22"/>
-            </w:rPr>
-            <w:t xml:space="preserve"> L, </w:t>
-          </w:r>
-          <w:proofErr w:type="spellStart"/>
-          <w:r>
-            <w:rPr>
-              <w:rFonts w:ascii="Times New Roman" w:eastAsia="Times New Roman" w:hAnsi="Times New Roman" w:cs="Times New Roman"/>
-              <w:color w:val="000000"/>
-              <w:sz w:val="22"/>
-            </w:rPr>
-            <w:t>Czarniecka</w:t>
-          </w:r>
-          <w:proofErr w:type="spellEnd"/>
-          <w:r>
-            <w:rPr>
-              <w:rFonts w:ascii="Times New Roman" w:eastAsia="Times New Roman" w:hAnsi="Times New Roman" w:cs="Times New Roman"/>
-              <w:color w:val="000000"/>
-              <w:sz w:val="22"/>
-            </w:rPr>
-            <w:t xml:space="preserve"> A, et al. 2023 European Thyroid Association Clinical Practice Guidelines for thyroid nodule management. </w:t>
+            <w:t xml:space="preserve">Durante C, Hegedüs L, Czarniecka A, et al. 2023 European Thyroid Association Clinical Practice Guidelines for thyroid nodule management. </w:t>
           </w:r>
           <w:proofErr w:type="spellStart"/>
           <w:r>
@@ -6926,24 +7247,7 @@
               <w:sz w:val="22"/>
             </w:rPr>
             <w:tab/>
-          </w:r>
-          <w:proofErr w:type="spellStart"/>
-          <w:r>
-            <w:rPr>
-              <w:rFonts w:ascii="Times New Roman" w:eastAsia="Times New Roman" w:hAnsi="Times New Roman" w:cs="Times New Roman"/>
-              <w:color w:val="000000"/>
-              <w:sz w:val="22"/>
-            </w:rPr>
-            <w:t>Ringel</w:t>
-          </w:r>
-          <w:proofErr w:type="spellEnd"/>
-          <w:r>
-            <w:rPr>
-              <w:rFonts w:ascii="Times New Roman" w:eastAsia="Times New Roman" w:hAnsi="Times New Roman" w:cs="Times New Roman"/>
-              <w:color w:val="000000"/>
-              <w:sz w:val="22"/>
-            </w:rPr>
-            <w:t xml:space="preserve"> MD, Sosa JA, Baloch Z, et al. 2025 American Thyroid Association Management Guidelines for Adult Patients with Differentiated Thyroid Cancer. </w:t>
+            <w:t xml:space="preserve">Ringel MD, Sosa JA, Baloch Z, et al. 2025 American Thyroid Association Management Guidelines for Adult Patients with Differentiated Thyroid Cancer. </w:t>
           </w:r>
           <w:r>
             <w:rPr>
@@ -6981,7 +7285,7 @@
               <w:rFonts w:ascii="Times New Roman" w:eastAsia="Times New Roman" w:hAnsi="Times New Roman" w:cs="Times New Roman"/>
               <w:color w:val="000000"/>
               <w:sz w:val="22"/>
-              <w:lang w:val="es-EC"/>
+              <w:lang w:val="en-US"/>
             </w:rPr>
             <w:t>10.</w:t>
           </w:r>
@@ -6990,7 +7294,7 @@
               <w:rFonts w:ascii="Times New Roman" w:eastAsia="Times New Roman" w:hAnsi="Times New Roman" w:cs="Times New Roman"/>
               <w:color w:val="000000"/>
               <w:sz w:val="22"/>
-              <w:lang w:val="es-EC"/>
+              <w:lang w:val="en-US"/>
             </w:rPr>
             <w:tab/>
             <w:t xml:space="preserve">Loor-Torres R, Duran M, Toro-Tobon D, et al. </w:t>
@@ -7085,43 +7389,7 @@
               <w:sz w:val="22"/>
             </w:rPr>
             <w:tab/>
-            <w:t>Toro-</w:t>
-          </w:r>
-          <w:proofErr w:type="spellStart"/>
-          <w:r>
-            <w:rPr>
-              <w:rFonts w:ascii="Times New Roman" w:eastAsia="Times New Roman" w:hAnsi="Times New Roman" w:cs="Times New Roman"/>
-              <w:color w:val="000000"/>
-              <w:sz w:val="22"/>
-            </w:rPr>
-            <w:t>Tobon</w:t>
-          </w:r>
-          <w:proofErr w:type="spellEnd"/>
-          <w:r>
-            <w:rPr>
-              <w:rFonts w:ascii="Times New Roman" w:eastAsia="Times New Roman" w:hAnsi="Times New Roman" w:cs="Times New Roman"/>
-              <w:color w:val="000000"/>
-              <w:sz w:val="22"/>
-            </w:rPr>
-            <w:t xml:space="preserve"> D, </w:t>
-          </w:r>
-          <w:proofErr w:type="spellStart"/>
-          <w:r>
-            <w:rPr>
-              <w:rFonts w:ascii="Times New Roman" w:eastAsia="Times New Roman" w:hAnsi="Times New Roman" w:cs="Times New Roman"/>
-              <w:color w:val="000000"/>
-              <w:sz w:val="22"/>
-            </w:rPr>
-            <w:t>Loor</w:t>
-          </w:r>
-          <w:proofErr w:type="spellEnd"/>
-          <w:r>
-            <w:rPr>
-              <w:rFonts w:ascii="Times New Roman" w:eastAsia="Times New Roman" w:hAnsi="Times New Roman" w:cs="Times New Roman"/>
-              <w:color w:val="000000"/>
-              <w:sz w:val="22"/>
-            </w:rPr>
-            <w:t xml:space="preserve">-Torres R, Duran M, et al. Artificial Intelligence in </w:t>
+            <w:t xml:space="preserve">Toro-Tobon D, Loor-Torres R, Duran M, et al. Artificial Intelligence in </w:t>
           </w:r>
           <w:proofErr w:type="spellStart"/>
           <w:r>
@@ -7206,25 +7474,7 @@
               <w:color w:val="000000"/>
               <w:sz w:val="22"/>
             </w:rPr>
-            <w:t xml:space="preserve"> A, Suleyman M, </w:t>
-          </w:r>
-          <w:proofErr w:type="spellStart"/>
-          <w:r>
-            <w:rPr>
-              <w:rFonts w:ascii="Times New Roman" w:eastAsia="Times New Roman" w:hAnsi="Times New Roman" w:cs="Times New Roman"/>
-              <w:color w:val="000000"/>
-              <w:sz w:val="22"/>
-            </w:rPr>
-            <w:t>Corrado</w:t>
-          </w:r>
-          <w:proofErr w:type="spellEnd"/>
-          <w:r>
-            <w:rPr>
-              <w:rFonts w:ascii="Times New Roman" w:eastAsia="Times New Roman" w:hAnsi="Times New Roman" w:cs="Times New Roman"/>
-              <w:color w:val="000000"/>
-              <w:sz w:val="22"/>
-            </w:rPr>
-            <w:t xml:space="preserve"> G, King D. Key challenges for delivering clinical impact with artificial intelligence. </w:t>
+            <w:t xml:space="preserve"> A, Suleyman M, Corrado G, King D. Key challenges for delivering clinical impact with artificial intelligence. </w:t>
           </w:r>
           <w:r>
             <w:rPr>
@@ -7277,6 +7527,15 @@
               <w:lang w:val="pt-BR"/>
             </w:rPr>
             <w:tab/>
+            <w:t xml:space="preserve">Solis Pazmino P, Pilatuna E, Ron M, et al. </w:t>
+          </w:r>
+          <w:r>
+            <w:rPr>
+              <w:rFonts w:ascii="Times New Roman" w:eastAsia="Times New Roman" w:hAnsi="Times New Roman" w:cs="Times New Roman"/>
+              <w:color w:val="000000"/>
+              <w:sz w:val="22"/>
+            </w:rPr>
+            <w:t>International Registry of thyroid cancer in Latin American (</w:t>
           </w:r>
           <w:proofErr w:type="spellStart"/>
           <w:r>
@@ -7284,9 +7543,8 @@
               <w:rFonts w:ascii="Times New Roman" w:eastAsia="Times New Roman" w:hAnsi="Times New Roman" w:cs="Times New Roman"/>
               <w:color w:val="000000"/>
               <w:sz w:val="22"/>
-              <w:lang w:val="pt-BR"/>
-            </w:rPr>
-            <w:t>Solis</w:t>
+            </w:rPr>
+            <w:t>CaTaLiNA</w:t>
           </w:r>
           <w:proofErr w:type="spellEnd"/>
           <w:r>
@@ -7294,57 +7552,8 @@
               <w:rFonts w:ascii="Times New Roman" w:eastAsia="Times New Roman" w:hAnsi="Times New Roman" w:cs="Times New Roman"/>
               <w:color w:val="000000"/>
               <w:sz w:val="22"/>
-              <w:lang w:val="pt-BR"/>
-            </w:rPr>
-            <w:t xml:space="preserve"> </w:t>
-          </w:r>
-          <w:proofErr w:type="spellStart"/>
-          <w:r>
-            <w:rPr>
-              <w:rFonts w:ascii="Times New Roman" w:eastAsia="Times New Roman" w:hAnsi="Times New Roman" w:cs="Times New Roman"/>
-              <w:color w:val="000000"/>
-              <w:sz w:val="22"/>
-              <w:lang w:val="pt-BR"/>
-            </w:rPr>
-            <w:t>Pazmino</w:t>
-          </w:r>
-          <w:proofErr w:type="spellEnd"/>
-          <w:r>
-            <w:rPr>
-              <w:rFonts w:ascii="Times New Roman" w:eastAsia="Times New Roman" w:hAnsi="Times New Roman" w:cs="Times New Roman"/>
-              <w:color w:val="000000"/>
-              <w:sz w:val="22"/>
-              <w:lang w:val="pt-BR"/>
-            </w:rPr>
-            <w:t xml:space="preserve"> P, </w:t>
-          </w:r>
-          <w:proofErr w:type="spellStart"/>
-          <w:r>
-            <w:rPr>
-              <w:rFonts w:ascii="Times New Roman" w:eastAsia="Times New Roman" w:hAnsi="Times New Roman" w:cs="Times New Roman"/>
-              <w:color w:val="000000"/>
-              <w:sz w:val="22"/>
-              <w:lang w:val="pt-BR"/>
-            </w:rPr>
-            <w:t>Pilatuna</w:t>
-          </w:r>
-          <w:proofErr w:type="spellEnd"/>
-          <w:r>
-            <w:rPr>
-              <w:rFonts w:ascii="Times New Roman" w:eastAsia="Times New Roman" w:hAnsi="Times New Roman" w:cs="Times New Roman"/>
-              <w:color w:val="000000"/>
-              <w:sz w:val="22"/>
-              <w:lang w:val="pt-BR"/>
-            </w:rPr>
-            <w:t xml:space="preserve"> E, Ron M, et al. </w:t>
-          </w:r>
-          <w:r>
-            <w:rPr>
-              <w:rFonts w:ascii="Times New Roman" w:eastAsia="Times New Roman" w:hAnsi="Times New Roman" w:cs="Times New Roman"/>
-              <w:color w:val="000000"/>
-              <w:sz w:val="22"/>
-            </w:rPr>
-            <w:t xml:space="preserve">International Registry of thyroid cancer in Latin American (CaTaLiNA): epidemiology, clinical and follow-up study protocol in Latin American countries during the period 2023-2028. </w:t>
+            </w:rPr>
+            <w:t xml:space="preserve">): epidemiology, clinical and follow-up study protocol in Latin American countries during the period 2023-2028. </w:t>
           </w:r>
           <w:r>
             <w:rPr>
@@ -7386,6 +7595,7 @@
               <w:sz w:val="22"/>
               <w:lang w:val="es-EC"/>
             </w:rPr>
+            <w:lastRenderedPageBreak/>
             <w:t>14.</w:t>
           </w:r>
           <w:r>
@@ -7396,7 +7606,27 @@
               <w:lang w:val="es-EC"/>
             </w:rPr>
             <w:tab/>
-            <w:t xml:space="preserve">El Kawkgi O, Toro-Tobon D, Toloza FJK, et al. </w:t>
+            <w:t xml:space="preserve">El </w:t>
+          </w:r>
+          <w:proofErr w:type="spellStart"/>
+          <w:r>
+            <w:rPr>
+              <w:rFonts w:ascii="Times New Roman" w:eastAsia="Times New Roman" w:hAnsi="Times New Roman" w:cs="Times New Roman"/>
+              <w:color w:val="000000"/>
+              <w:sz w:val="22"/>
+              <w:lang w:val="es-EC"/>
+            </w:rPr>
+            <w:t>Kawkgi</w:t>
+          </w:r>
+          <w:proofErr w:type="spellEnd"/>
+          <w:r>
+            <w:rPr>
+              <w:rFonts w:ascii="Times New Roman" w:eastAsia="Times New Roman" w:hAnsi="Times New Roman" w:cs="Times New Roman"/>
+              <w:color w:val="000000"/>
+              <w:sz w:val="22"/>
+              <w:lang w:val="es-EC"/>
+            </w:rPr>
+            <w:t xml:space="preserve"> O, Toro-Tobon D, Toloza FJK, et al. </w:t>
           </w:r>
           <w:r>
             <w:rPr>
@@ -7470,43 +7700,7 @@
               <w:sz w:val="22"/>
             </w:rPr>
             <w:tab/>
-            <w:t>Brito JP, Toro-</w:t>
-          </w:r>
-          <w:proofErr w:type="spellStart"/>
-          <w:r>
-            <w:rPr>
-              <w:rFonts w:ascii="Times New Roman" w:eastAsia="Times New Roman" w:hAnsi="Times New Roman" w:cs="Times New Roman"/>
-              <w:color w:val="000000"/>
-              <w:sz w:val="22"/>
-            </w:rPr>
-            <w:t>Tobon</w:t>
-          </w:r>
-          <w:proofErr w:type="spellEnd"/>
-          <w:r>
-            <w:rPr>
-              <w:rFonts w:ascii="Times New Roman" w:eastAsia="Times New Roman" w:hAnsi="Times New Roman" w:cs="Times New Roman"/>
-              <w:color w:val="000000"/>
-              <w:sz w:val="22"/>
-            </w:rPr>
-            <w:t xml:space="preserve"> D, </w:t>
-          </w:r>
-          <w:proofErr w:type="spellStart"/>
-          <w:r>
-            <w:rPr>
-              <w:rFonts w:ascii="Times New Roman" w:eastAsia="Times New Roman" w:hAnsi="Times New Roman" w:cs="Times New Roman"/>
-              <w:color w:val="000000"/>
-              <w:sz w:val="22"/>
-            </w:rPr>
-            <w:t>Montori</w:t>
-          </w:r>
-          <w:proofErr w:type="spellEnd"/>
-          <w:r>
-            <w:rPr>
-              <w:rFonts w:ascii="Times New Roman" w:eastAsia="Times New Roman" w:hAnsi="Times New Roman" w:cs="Times New Roman"/>
-              <w:color w:val="000000"/>
-              <w:sz w:val="22"/>
-            </w:rPr>
-            <w:t xml:space="preserve"> VM. Thyroid Nodule Molecular Classifiers-Reclaiming Deliberation in an Era of Automation. </w:t>
+            <w:t xml:space="preserve">Brito JP, Toro-Tobon D, Montori VM. Thyroid Nodule Molecular Classifiers-Reclaiming Deliberation in an Era of Automation. </w:t>
           </w:r>
           <w:r>
             <w:rPr>
@@ -7544,7 +7738,7 @@
               <w:rFonts w:ascii="Times New Roman" w:eastAsia="Times New Roman" w:hAnsi="Times New Roman" w:cs="Times New Roman"/>
               <w:color w:val="000000"/>
               <w:sz w:val="22"/>
-              <w:lang w:val="es-EC"/>
+              <w:lang w:val="en-US"/>
             </w:rPr>
             <w:t>16.</w:t>
           </w:r>
@@ -7553,7 +7747,7 @@
               <w:rFonts w:ascii="Times New Roman" w:eastAsia="Times New Roman" w:hAnsi="Times New Roman" w:cs="Times New Roman"/>
               <w:color w:val="000000"/>
               <w:sz w:val="22"/>
-              <w:lang w:val="es-EC"/>
+              <w:lang w:val="en-US"/>
             </w:rPr>
             <w:tab/>
             <w:t xml:space="preserve">Loor-Torres R, Wu Y, Esteban Cabezas, et al. </w:t>
@@ -7564,7 +7758,25 @@
               <w:color w:val="000000"/>
               <w:sz w:val="22"/>
             </w:rPr>
-            <w:t xml:space="preserve">Use of Natural Language Processing to Extract and Classify Papillary Thyroid Cancer Features From Surgical Pathology Reports. </w:t>
+            <w:t xml:space="preserve">Use of Natural Language Processing to Extract and Classify Papillary Thyroid Cancer Features </w:t>
+          </w:r>
+          <w:proofErr w:type="gramStart"/>
+          <w:r>
+            <w:rPr>
+              <w:rFonts w:ascii="Times New Roman" w:eastAsia="Times New Roman" w:hAnsi="Times New Roman" w:cs="Times New Roman"/>
+              <w:color w:val="000000"/>
+              <w:sz w:val="22"/>
+            </w:rPr>
+            <w:t>From</w:t>
+          </w:r>
+          <w:proofErr w:type="gramEnd"/>
+          <w:r>
+            <w:rPr>
+              <w:rFonts w:ascii="Times New Roman" w:eastAsia="Times New Roman" w:hAnsi="Times New Roman" w:cs="Times New Roman"/>
+              <w:color w:val="000000"/>
+              <w:sz w:val="22"/>
+            </w:rPr>
+            <w:t xml:space="preserve"> Surgical Pathology Reports. </w:t>
           </w:r>
           <w:r>
             <w:rPr>
@@ -7630,25 +7842,7 @@
               <w:sz w:val="22"/>
             </w:rPr>
             <w:tab/>
-            <w:t xml:space="preserve">Collins GS, Moons KGM, </w:t>
-          </w:r>
-          <w:proofErr w:type="spellStart"/>
-          <w:r>
-            <w:rPr>
-              <w:rFonts w:ascii="Times New Roman" w:eastAsia="Times New Roman" w:hAnsi="Times New Roman" w:cs="Times New Roman"/>
-              <w:color w:val="000000"/>
-              <w:sz w:val="22"/>
-            </w:rPr>
-            <w:t>Dhiman</w:t>
-          </w:r>
-          <w:proofErr w:type="spellEnd"/>
-          <w:r>
-            <w:rPr>
-              <w:rFonts w:ascii="Times New Roman" w:eastAsia="Times New Roman" w:hAnsi="Times New Roman" w:cs="Times New Roman"/>
-              <w:color w:val="000000"/>
-              <w:sz w:val="22"/>
-            </w:rPr>
-            <w:t xml:space="preserve"> P, et al. TRIPOD+AI statement: updated guidance for reporting clinical prediction models that use regression or machine learning methods. </w:t>
+            <w:t xml:space="preserve">Collins GS, Moons KGM, Dhiman P, et al. TRIPOD+AI statement: updated guidance for reporting clinical prediction models that use regression or machine learning methods. </w:t>
           </w:r>
           <w:r>
             <w:rPr>
@@ -7701,7 +7895,7 @@
 </file>
 
 <file path=word/endnotes.xml><?xml version="1.0" encoding="utf-8"?>
-<w:endnotes xmlns:wpc="http://schemas.microsoft.com/office/word/2010/wordprocessingCanvas" xmlns:cx="http://schemas.microsoft.com/office/drawing/2014/chartex" xmlns:cx1="http://schemas.microsoft.com/office/drawing/2015/9/8/chartex" xmlns:cx2="http://schemas.microsoft.com/office/drawing/2015/10/21/chartex" xmlns:cx3="http://schemas.microsoft.com/office/drawing/2016/5/9/chartex" xmlns:cx4="http://schemas.microsoft.com/office/drawing/2016/5/10/chartex" xmlns:cx5="http://schemas.microsoft.com/office/drawing/2016/5/11/chartex" xmlns:cx6="http://schemas.microsoft.com/office/drawing/2016/5/12/chartex" xmlns:cx7="http://schemas.microsoft.com/office/drawing/2016/5/13/chartex" xmlns:cx8="http://schemas.microsoft.com/office/drawing/2016/5/14/chartex" xmlns:mc="http://schemas.openxmlformats.org/markup-compatibility/2006" xmlns:aink="http://schemas.microsoft.com/office/drawing/2016/ink" xmlns:am3d="http://schemas.microsoft.com/office/drawing/2017/model3d" xmlns:o="urn:schemas-microsoft-com:office:office" xmlns:r="http://schemas.openxmlformats.org/officeDocument/2006/relationships" xmlns:m="http://schemas.openxmlformats.org/officeDocument/2006/math" xmlns:v="urn:schemas-microsoft-com:vml" xmlns:wp14="http://schemas.microsoft.com/office/word/2010/wordprocessingDrawing" xmlns:wp="http://schemas.openxmlformats.org/drawingml/2006/wordprocessingDrawing" xmlns:w10="urn:schemas-microsoft-com:office:word" xmlns:w="http://schemas.openxmlformats.org/wordprocessingml/2006/main" xmlns:w14="http://schemas.microsoft.com/office/word/2010/wordml" xmlns:w15="http://schemas.microsoft.com/office/word/2012/wordml" xmlns:w16cid="http://schemas.microsoft.com/office/word/2016/wordml/cid" xmlns:w16se="http://schemas.microsoft.com/office/word/2015/wordml/symex" xmlns:wpg="http://schemas.microsoft.com/office/word/2010/wordprocessingGroup" xmlns:wpi="http://schemas.microsoft.com/office/word/2010/wordprocessingInk" xmlns:wne="http://schemas.microsoft.com/office/word/2006/wordml" xmlns:wps="http://schemas.microsoft.com/office/word/2010/wordprocessingShape" mc:Ignorable="w14 w15 w16se w16cid wp14">
+<w:endnotes xmlns:wpc="http://schemas.microsoft.com/office/word/2010/wordprocessingCanvas" xmlns:cx="http://schemas.microsoft.com/office/drawing/2014/chartex" xmlns:cx1="http://schemas.microsoft.com/office/drawing/2015/9/8/chartex" xmlns:cx2="http://schemas.microsoft.com/office/drawing/2015/10/21/chartex" xmlns:cx3="http://schemas.microsoft.com/office/drawing/2016/5/9/chartex" xmlns:cx4="http://schemas.microsoft.com/office/drawing/2016/5/10/chartex" xmlns:cx5="http://schemas.microsoft.com/office/drawing/2016/5/11/chartex" xmlns:cx6="http://schemas.microsoft.com/office/drawing/2016/5/12/chartex" xmlns:cx7="http://schemas.microsoft.com/office/drawing/2016/5/13/chartex" xmlns:cx8="http://schemas.microsoft.com/office/drawing/2016/5/14/chartex" xmlns:mc="http://schemas.openxmlformats.org/markup-compatibility/2006" xmlns:aink="http://schemas.microsoft.com/office/drawing/2016/ink" xmlns:am3d="http://schemas.microsoft.com/office/drawing/2017/model3d" xmlns:o="urn:schemas-microsoft-com:office:office" xmlns:oel="http://schemas.microsoft.com/office/2019/extlst" xmlns:r="http://schemas.openxmlformats.org/officeDocument/2006/relationships" xmlns:m="http://schemas.openxmlformats.org/officeDocument/2006/math" xmlns:v="urn:schemas-microsoft-com:vml" xmlns:wp14="http://schemas.microsoft.com/office/word/2010/wordprocessingDrawing" xmlns:wp="http://schemas.openxmlformats.org/drawingml/2006/wordprocessingDrawing" xmlns:w10="urn:schemas-microsoft-com:office:word" xmlns:w="http://schemas.openxmlformats.org/wordprocessingml/2006/main" xmlns:w14="http://schemas.microsoft.com/office/word/2010/wordml" xmlns:w15="http://schemas.microsoft.com/office/word/2012/wordml" xmlns:w16cex="http://schemas.microsoft.com/office/word/2018/wordml/cex" xmlns:w16cid="http://schemas.microsoft.com/office/word/2016/wordml/cid" xmlns:w16="http://schemas.microsoft.com/office/word/2018/wordml" xmlns:w16du="http://schemas.microsoft.com/office/word/2023/wordml/word16du" xmlns:w16sdtdh="http://schemas.microsoft.com/office/word/2020/wordml/sdtdatahash" xmlns:w16sdtfl="http://schemas.microsoft.com/office/word/2024/wordml/sdtformatlock" xmlns:w16se="http://schemas.microsoft.com/office/word/2015/wordml/symex" xmlns:wpg="http://schemas.microsoft.com/office/word/2010/wordprocessingGroup" xmlns:wpi="http://schemas.microsoft.com/office/word/2010/wordprocessingInk" xmlns:wne="http://schemas.microsoft.com/office/word/2006/wordml" xmlns:wps="http://schemas.microsoft.com/office/word/2010/wordprocessingShape" mc:Ignorable="w14 w15 w16se w16cid w16 w16cex w16sdtdh w16sdtfl w16du wp14">
   <w:endnote w:type="separator" w:id="-1">
     <w:p>
       <w:r>
@@ -7720,7 +7914,7 @@
 </file>
 
 <file path=word/footnotes.xml><?xml version="1.0" encoding="utf-8"?>
-<w:footnotes xmlns:wpc="http://schemas.microsoft.com/office/word/2010/wordprocessingCanvas" xmlns:cx="http://schemas.microsoft.com/office/drawing/2014/chartex" xmlns:cx1="http://schemas.microsoft.com/office/drawing/2015/9/8/chartex" xmlns:cx2="http://schemas.microsoft.com/office/drawing/2015/10/21/chartex" xmlns:cx3="http://schemas.microsoft.com/office/drawing/2016/5/9/chartex" xmlns:cx4="http://schemas.microsoft.com/office/drawing/2016/5/10/chartex" xmlns:cx5="http://schemas.microsoft.com/office/drawing/2016/5/11/chartex" xmlns:cx6="http://schemas.microsoft.com/office/drawing/2016/5/12/chartex" xmlns:cx7="http://schemas.microsoft.com/office/drawing/2016/5/13/chartex" xmlns:cx8="http://schemas.microsoft.com/office/drawing/2016/5/14/chartex" xmlns:mc="http://schemas.openxmlformats.org/markup-compatibility/2006" xmlns:aink="http://schemas.microsoft.com/office/drawing/2016/ink" xmlns:am3d="http://schemas.microsoft.com/office/drawing/2017/model3d" xmlns:o="urn:schemas-microsoft-com:office:office" xmlns:r="http://schemas.openxmlformats.org/officeDocument/2006/relationships" xmlns:m="http://schemas.openxmlformats.org/officeDocument/2006/math" xmlns:v="urn:schemas-microsoft-com:vml" xmlns:wp14="http://schemas.microsoft.com/office/word/2010/wordprocessingDrawing" xmlns:wp="http://schemas.openxmlformats.org/drawingml/2006/wordprocessingDrawing" xmlns:w10="urn:schemas-microsoft-com:office:word" xmlns:w="http://schemas.openxmlformats.org/wordprocessingml/2006/main" xmlns:w14="http://schemas.microsoft.com/office/word/2010/wordml" xmlns:w15="http://schemas.microsoft.com/office/word/2012/wordml" xmlns:w16cid="http://schemas.microsoft.com/office/word/2016/wordml/cid" xmlns:w16se="http://schemas.microsoft.com/office/word/2015/wordml/symex" xmlns:wpg="http://schemas.microsoft.com/office/word/2010/wordprocessingGroup" xmlns:wpi="http://schemas.microsoft.com/office/word/2010/wordprocessingInk" xmlns:wne="http://schemas.microsoft.com/office/word/2006/wordml" xmlns:wps="http://schemas.microsoft.com/office/word/2010/wordprocessingShape" mc:Ignorable="w14 w15 w16se w16cid wp14">
+<w:footnotes xmlns:wpc="http://schemas.microsoft.com/office/word/2010/wordprocessingCanvas" xmlns:cx="http://schemas.microsoft.com/office/drawing/2014/chartex" xmlns:cx1="http://schemas.microsoft.com/office/drawing/2015/9/8/chartex" xmlns:cx2="http://schemas.microsoft.com/office/drawing/2015/10/21/chartex" xmlns:cx3="http://schemas.microsoft.com/office/drawing/2016/5/9/chartex" xmlns:cx4="http://schemas.microsoft.com/office/drawing/2016/5/10/chartex" xmlns:cx5="http://schemas.microsoft.com/office/drawing/2016/5/11/chartex" xmlns:cx6="http://schemas.microsoft.com/office/drawing/2016/5/12/chartex" xmlns:cx7="http://schemas.microsoft.com/office/drawing/2016/5/13/chartex" xmlns:cx8="http://schemas.microsoft.com/office/drawing/2016/5/14/chartex" xmlns:mc="http://schemas.openxmlformats.org/markup-compatibility/2006" xmlns:aink="http://schemas.microsoft.com/office/drawing/2016/ink" xmlns:am3d="http://schemas.microsoft.com/office/drawing/2017/model3d" xmlns:o="urn:schemas-microsoft-com:office:office" xmlns:oel="http://schemas.microsoft.com/office/2019/extlst" xmlns:r="http://schemas.openxmlformats.org/officeDocument/2006/relationships" xmlns:m="http://schemas.openxmlformats.org/officeDocument/2006/math" xmlns:v="urn:schemas-microsoft-com:vml" xmlns:wp14="http://schemas.microsoft.com/office/word/2010/wordprocessingDrawing" xmlns:wp="http://schemas.openxmlformats.org/drawingml/2006/wordprocessingDrawing" xmlns:w10="urn:schemas-microsoft-com:office:word" xmlns:w="http://schemas.openxmlformats.org/wordprocessingml/2006/main" xmlns:w14="http://schemas.microsoft.com/office/word/2010/wordml" xmlns:w15="http://schemas.microsoft.com/office/word/2012/wordml" xmlns:w16cex="http://schemas.microsoft.com/office/word/2018/wordml/cex" xmlns:w16cid="http://schemas.microsoft.com/office/word/2016/wordml/cid" xmlns:w16="http://schemas.microsoft.com/office/word/2018/wordml" xmlns:w16du="http://schemas.microsoft.com/office/word/2023/wordml/word16du" xmlns:w16sdtdh="http://schemas.microsoft.com/office/word/2020/wordml/sdtdatahash" xmlns:w16sdtfl="http://schemas.microsoft.com/office/word/2024/wordml/sdtformatlock" xmlns:w16se="http://schemas.microsoft.com/office/word/2015/wordml/symex" xmlns:wpg="http://schemas.microsoft.com/office/word/2010/wordprocessingGroup" xmlns:wpi="http://schemas.microsoft.com/office/word/2010/wordprocessingInk" xmlns:wne="http://schemas.microsoft.com/office/word/2006/wordml" xmlns:wps="http://schemas.microsoft.com/office/word/2010/wordprocessingShape" mc:Ignorable="w14 w15 w16se w16cid w16 w16cex w16sdtdh w16sdtfl w16du wp14">
   <w:footnote w:type="separator" w:id="-1">
     <w:p>
       <w:r>
@@ -7739,7 +7933,7 @@
 </file>
 
 <file path=word/numbering.xml><?xml version="1.0" encoding="utf-8"?>
-<w:numbering xmlns:wpc="http://schemas.microsoft.com/office/word/2010/wordprocessingCanvas" xmlns:cx="http://schemas.microsoft.com/office/drawing/2014/chartex" xmlns:cx1="http://schemas.microsoft.com/office/drawing/2015/9/8/chartex" xmlns:cx2="http://schemas.microsoft.com/office/drawing/2015/10/21/chartex" xmlns:cx3="http://schemas.microsoft.com/office/drawing/2016/5/9/chartex" xmlns:cx4="http://schemas.microsoft.com/office/drawing/2016/5/10/chartex" xmlns:cx5="http://schemas.microsoft.com/office/drawing/2016/5/11/chartex" xmlns:cx6="http://schemas.microsoft.com/office/drawing/2016/5/12/chartex" xmlns:cx7="http://schemas.microsoft.com/office/drawing/2016/5/13/chartex" xmlns:cx8="http://schemas.microsoft.com/office/drawing/2016/5/14/chartex" xmlns:mc="http://schemas.openxmlformats.org/markup-compatibility/2006" xmlns:aink="http://schemas.microsoft.com/office/drawing/2016/ink" xmlns:am3d="http://schemas.microsoft.com/office/drawing/2017/model3d" xmlns:o="urn:schemas-microsoft-com:office:office" xmlns:r="http://schemas.openxmlformats.org/officeDocument/2006/relationships" xmlns:m="http://schemas.openxmlformats.org/officeDocument/2006/math" xmlns:v="urn:schemas-microsoft-com:vml" xmlns:wp14="http://schemas.microsoft.com/office/word/2010/wordprocessingDrawing" xmlns:wp="http://schemas.openxmlformats.org/drawingml/2006/wordprocessingDrawing" xmlns:w10="urn:schemas-microsoft-com:office:word" xmlns:w="http://schemas.openxmlformats.org/wordprocessingml/2006/main" xmlns:w14="http://schemas.microsoft.com/office/word/2010/wordml" xmlns:w15="http://schemas.microsoft.com/office/word/2012/wordml" xmlns:w16cid="http://schemas.microsoft.com/office/word/2016/wordml/cid" xmlns:w16se="http://schemas.microsoft.com/office/word/2015/wordml/symex" xmlns:wpg="http://schemas.microsoft.com/office/word/2010/wordprocessingGroup" xmlns:wpi="http://schemas.microsoft.com/office/word/2010/wordprocessingInk" xmlns:wne="http://schemas.microsoft.com/office/word/2006/wordml" xmlns:wps="http://schemas.microsoft.com/office/word/2010/wordprocessingShape" mc:Ignorable="w14 w15 w16se w16cid wp14">
+<w:numbering xmlns:wpc="http://schemas.microsoft.com/office/word/2010/wordprocessingCanvas" xmlns:cx="http://schemas.microsoft.com/office/drawing/2014/chartex" xmlns:cx1="http://schemas.microsoft.com/office/drawing/2015/9/8/chartex" xmlns:cx2="http://schemas.microsoft.com/office/drawing/2015/10/21/chartex" xmlns:cx3="http://schemas.microsoft.com/office/drawing/2016/5/9/chartex" xmlns:cx4="http://schemas.microsoft.com/office/drawing/2016/5/10/chartex" xmlns:cx5="http://schemas.microsoft.com/office/drawing/2016/5/11/chartex" xmlns:cx6="http://schemas.microsoft.com/office/drawing/2016/5/12/chartex" xmlns:cx7="http://schemas.microsoft.com/office/drawing/2016/5/13/chartex" xmlns:cx8="http://schemas.microsoft.com/office/drawing/2016/5/14/chartex" xmlns:mc="http://schemas.openxmlformats.org/markup-compatibility/2006" xmlns:aink="http://schemas.microsoft.com/office/drawing/2016/ink" xmlns:am3d="http://schemas.microsoft.com/office/drawing/2017/model3d" xmlns:o="urn:schemas-microsoft-com:office:office" xmlns:oel="http://schemas.microsoft.com/office/2019/extlst" xmlns:r="http://schemas.openxmlformats.org/officeDocument/2006/relationships" xmlns:m="http://schemas.openxmlformats.org/officeDocument/2006/math" xmlns:v="urn:schemas-microsoft-com:vml" xmlns:wp14="http://schemas.microsoft.com/office/word/2010/wordprocessingDrawing" xmlns:wp="http://schemas.openxmlformats.org/drawingml/2006/wordprocessingDrawing" xmlns:w10="urn:schemas-microsoft-com:office:word" xmlns:w="http://schemas.openxmlformats.org/wordprocessingml/2006/main" xmlns:w14="http://schemas.microsoft.com/office/word/2010/wordml" xmlns:w15="http://schemas.microsoft.com/office/word/2012/wordml" xmlns:w16cex="http://schemas.microsoft.com/office/word/2018/wordml/cex" xmlns:w16cid="http://schemas.microsoft.com/office/word/2016/wordml/cid" xmlns:w16="http://schemas.microsoft.com/office/word/2018/wordml" xmlns:w16du="http://schemas.microsoft.com/office/word/2023/wordml/word16du" xmlns:w16sdtdh="http://schemas.microsoft.com/office/word/2020/wordml/sdtdatahash" xmlns:w16sdtfl="http://schemas.microsoft.com/office/word/2024/wordml/sdtformatlock" xmlns:w16se="http://schemas.microsoft.com/office/word/2015/wordml/symex" xmlns:wpg="http://schemas.microsoft.com/office/word/2010/wordprocessingGroup" xmlns:wpi="http://schemas.microsoft.com/office/word/2010/wordprocessingInk" xmlns:wne="http://schemas.microsoft.com/office/word/2006/wordml" xmlns:wps="http://schemas.microsoft.com/office/word/2010/wordprocessingShape" mc:Ignorable="w14 w15 w16se w16cid w16 w16cex w16sdtdh w16sdtfl w16du wp14">
   <w:abstractNum w:abstractNumId="0" w15:restartNumberingAfterBreak="0">
     <w:nsid w:val="07656A08"/>
     <w:multiLevelType w:val="multilevel"/>
@@ -9326,50 +9520,50 @@
       </w:rPr>
     </w:lvl>
   </w:abstractNum>
-  <w:num w:numId="1">
+  <w:num w:numId="1" w16cid:durableId="555822829">
     <w:abstractNumId w:val="1"/>
   </w:num>
-  <w:num w:numId="2">
+  <w:num w:numId="2" w16cid:durableId="1102263526">
     <w:abstractNumId w:val="6"/>
   </w:num>
-  <w:num w:numId="3">
+  <w:num w:numId="3" w16cid:durableId="367874211">
     <w:abstractNumId w:val="7"/>
   </w:num>
-  <w:num w:numId="4">
+  <w:num w:numId="4" w16cid:durableId="508104094">
     <w:abstractNumId w:val="2"/>
   </w:num>
-  <w:num w:numId="5">
+  <w:num w:numId="5" w16cid:durableId="1331525787">
     <w:abstractNumId w:val="0"/>
   </w:num>
-  <w:num w:numId="6">
+  <w:num w:numId="6" w16cid:durableId="1257059602">
     <w:abstractNumId w:val="3"/>
   </w:num>
-  <w:num w:numId="7">
+  <w:num w:numId="7" w16cid:durableId="1907452073">
     <w:abstractNumId w:val="11"/>
   </w:num>
-  <w:num w:numId="8">
+  <w:num w:numId="8" w16cid:durableId="1256401039">
     <w:abstractNumId w:val="10"/>
   </w:num>
-  <w:num w:numId="9">
+  <w:num w:numId="9" w16cid:durableId="293483216">
     <w:abstractNumId w:val="12"/>
   </w:num>
-  <w:num w:numId="10">
+  <w:num w:numId="10" w16cid:durableId="537546362">
     <w:abstractNumId w:val="9"/>
   </w:num>
-  <w:num w:numId="11">
+  <w:num w:numId="11" w16cid:durableId="2033144622">
     <w:abstractNumId w:val="8"/>
   </w:num>
-  <w:num w:numId="12">
+  <w:num w:numId="12" w16cid:durableId="869611302">
     <w:abstractNumId w:val="5"/>
   </w:num>
-  <w:num w:numId="13">
+  <w:num w:numId="13" w16cid:durableId="1354764236">
     <w:abstractNumId w:val="4"/>
   </w:num>
 </w:numbering>
 </file>
 
 <file path=word/styles.xml><?xml version="1.0" encoding="utf-8"?>
-<w:styles xmlns:mc="http://schemas.openxmlformats.org/markup-compatibility/2006" xmlns:r="http://schemas.openxmlformats.org/officeDocument/2006/relationships" xmlns:w="http://schemas.openxmlformats.org/wordprocessingml/2006/main" xmlns:w14="http://schemas.microsoft.com/office/word/2010/wordml" xmlns:w15="http://schemas.microsoft.com/office/word/2012/wordml" xmlns:w16cid="http://schemas.microsoft.com/office/word/2016/wordml/cid" xmlns:w16se="http://schemas.microsoft.com/office/word/2015/wordml/symex" mc:Ignorable="w14 w15 w16se w16cid">
+<w:styles xmlns:mc="http://schemas.openxmlformats.org/markup-compatibility/2006" xmlns:r="http://schemas.openxmlformats.org/officeDocument/2006/relationships" xmlns:w="http://schemas.openxmlformats.org/wordprocessingml/2006/main" xmlns:w14="http://schemas.microsoft.com/office/word/2010/wordml" xmlns:w15="http://schemas.microsoft.com/office/word/2012/wordml" xmlns:w16cex="http://schemas.microsoft.com/office/word/2018/wordml/cex" xmlns:w16cid="http://schemas.microsoft.com/office/word/2016/wordml/cid" xmlns:w16="http://schemas.microsoft.com/office/word/2018/wordml" xmlns:w16du="http://schemas.microsoft.com/office/word/2023/wordml/word16du" xmlns:w16sdtdh="http://schemas.microsoft.com/office/word/2020/wordml/sdtdatahash" xmlns:w16sdtfl="http://schemas.microsoft.com/office/word/2024/wordml/sdtformatlock" xmlns:w16se="http://schemas.microsoft.com/office/word/2015/wordml/symex" mc:Ignorable="w14 w15 w16se w16cid w16 w16cex w16sdtdh w16sdtfl w16du">
   <w:docDefaults>
     <w:rPrDefault>
       <w:rPr>
@@ -9381,7 +9575,7 @@
     </w:rPrDefault>
     <w:pPrDefault/>
   </w:docDefaults>
-  <w:latentStyles w:defLockedState="0" w:defUIPriority="99" w:defSemiHidden="0" w:defUnhideWhenUsed="0" w:defQFormat="0" w:count="375">
+  <w:latentStyles w:defLockedState="0" w:defUIPriority="99" w:defSemiHidden="0" w:defUnhideWhenUsed="0" w:defQFormat="0" w:count="376">
     <w:lsdException w:name="Normal" w:uiPriority="0" w:qFormat="1"/>
     <w:lsdException w:name="heading 1" w:uiPriority="9" w:qFormat="1"/>
     <w:lsdException w:name="heading 2" w:semiHidden="1" w:uiPriority="9" w:unhideWhenUsed="1" w:qFormat="1"/>
@@ -9757,12 +9951,13 @@
     <w:lsdException w:name="Smart Hyperlink" w:semiHidden="1" w:unhideWhenUsed="1"/>
     <w:lsdException w:name="Hashtag" w:semiHidden="1" w:unhideWhenUsed="1"/>
     <w:lsdException w:name="Unresolved Mention" w:semiHidden="1" w:unhideWhenUsed="1"/>
+    <w:lsdException w:name="Smart Link" w:semiHidden="1" w:unhideWhenUsed="1"/>
   </w:latentStyles>
   <w:style w:type="paragraph" w:default="1" w:styleId="Normal">
     <w:name w:val="Normal"/>
     <w:qFormat/>
   </w:style>
-  <w:style w:type="paragraph" w:styleId="Ttulo1">
+  <w:style w:type="paragraph" w:styleId="Heading1">
     <w:name w:val="heading 1"/>
     <w:basedOn w:val="Normal"/>
     <w:next w:val="Normal"/>
@@ -9781,7 +9976,7 @@
       <w:szCs w:val="48"/>
     </w:rPr>
   </w:style>
-  <w:style w:type="paragraph" w:styleId="Ttulo2">
+  <w:style w:type="paragraph" w:styleId="Heading2">
     <w:name w:val="heading 2"/>
     <w:basedOn w:val="Normal"/>
     <w:next w:val="Normal"/>
@@ -9802,7 +9997,7 @@
       <w:szCs w:val="36"/>
     </w:rPr>
   </w:style>
-  <w:style w:type="paragraph" w:styleId="Ttulo3">
+  <w:style w:type="paragraph" w:styleId="Heading3">
     <w:name w:val="heading 3"/>
     <w:basedOn w:val="Normal"/>
     <w:next w:val="Normal"/>
@@ -9823,7 +10018,7 @@
       <w:szCs w:val="28"/>
     </w:rPr>
   </w:style>
-  <w:style w:type="paragraph" w:styleId="Ttulo4">
+  <w:style w:type="paragraph" w:styleId="Heading4">
     <w:name w:val="heading 4"/>
     <w:basedOn w:val="Normal"/>
     <w:next w:val="Normal"/>
@@ -9842,7 +10037,7 @@
       <w:bCs/>
     </w:rPr>
   </w:style>
-  <w:style w:type="paragraph" w:styleId="Ttulo5">
+  <w:style w:type="paragraph" w:styleId="Heading5">
     <w:name w:val="heading 5"/>
     <w:basedOn w:val="Normal"/>
     <w:next w:val="Normal"/>
@@ -9863,7 +10058,7 @@
       <w:szCs w:val="22"/>
     </w:rPr>
   </w:style>
-  <w:style w:type="paragraph" w:styleId="Ttulo6">
+  <w:style w:type="paragraph" w:styleId="Heading6">
     <w:name w:val="heading 6"/>
     <w:basedOn w:val="Normal"/>
     <w:next w:val="Normal"/>
@@ -9884,13 +10079,12 @@
       <w:szCs w:val="20"/>
     </w:rPr>
   </w:style>
-  <w:style w:type="character" w:default="1" w:styleId="Fuentedeprrafopredeter">
+  <w:style w:type="character" w:default="1" w:styleId="DefaultParagraphFont">
     <w:name w:val="Default Paragraph Font"/>
     <w:uiPriority w:val="1"/>
-    <w:semiHidden/>
     <w:unhideWhenUsed/>
   </w:style>
-  <w:style w:type="table" w:default="1" w:styleId="Tablanormal">
+  <w:style w:type="table" w:default="1" w:styleId="TableNormal">
     <w:name w:val="Normal Table"/>
     <w:uiPriority w:val="99"/>
     <w:semiHidden/>
@@ -9905,13 +10099,13 @@
       </w:tblCellMar>
     </w:tblPr>
   </w:style>
-  <w:style w:type="numbering" w:default="1" w:styleId="Sinlista">
+  <w:style w:type="numbering" w:default="1" w:styleId="NoList">
     <w:name w:val="No List"/>
     <w:uiPriority w:val="99"/>
     <w:semiHidden/>
     <w:unhideWhenUsed/>
   </w:style>
-  <w:style w:type="table" w:customStyle="1" w:styleId="TableNormal">
+  <w:style w:type="table" w:customStyle="1" w:styleId="TableNormal0">
     <w:name w:val="TableNormal"/>
     <w:tblPr>
       <w:tblCellMar>
@@ -9922,7 +10116,7 @@
       </w:tblCellMar>
     </w:tblPr>
   </w:style>
-  <w:style w:type="paragraph" w:styleId="Ttulo">
+  <w:style w:type="paragraph" w:styleId="Title">
     <w:name w:val="Title"/>
     <w:basedOn w:val="Normal"/>
     <w:next w:val="Normal"/>
@@ -9940,9 +10134,9 @@
       <w:szCs w:val="72"/>
     </w:rPr>
   </w:style>
-  <w:style w:type="table" w:styleId="Tablaconcuadrcula">
+  <w:style w:type="table" w:styleId="TableGrid">
     <w:name w:val="Table Grid"/>
-    <w:basedOn w:val="Tablanormal"/>
+    <w:basedOn w:val="TableNormal"/>
     <w:uiPriority w:val="39"/>
     <w:rsid w:val="0001166B"/>
     <w:tblPr>
@@ -9956,9 +10150,9 @@
       </w:tblBorders>
     </w:tblPr>
   </w:style>
-  <w:style w:type="character" w:styleId="Refdecomentario">
+  <w:style w:type="character" w:styleId="CommentReference">
     <w:name w:val="annotation reference"/>
-    <w:basedOn w:val="Fuentedeprrafopredeter"/>
+    <w:basedOn w:val="DefaultParagraphFont"/>
     <w:uiPriority w:val="99"/>
     <w:semiHidden/>
     <w:unhideWhenUsed/>
@@ -9968,10 +10162,10 @@
       <w:szCs w:val="16"/>
     </w:rPr>
   </w:style>
-  <w:style w:type="paragraph" w:styleId="Textocomentario">
+  <w:style w:type="paragraph" w:styleId="CommentText">
     <w:name w:val="annotation text"/>
     <w:basedOn w:val="Normal"/>
-    <w:link w:val="TextocomentarioCar"/>
+    <w:link w:val="CommentTextChar"/>
     <w:uiPriority w:val="99"/>
     <w:unhideWhenUsed/>
     <w:rsid w:val="00B5482D"/>
@@ -9980,10 +10174,10 @@
       <w:szCs w:val="20"/>
     </w:rPr>
   </w:style>
-  <w:style w:type="character" w:customStyle="1" w:styleId="TextocomentarioCar">
-    <w:name w:val="Texto comentario Car"/>
-    <w:basedOn w:val="Fuentedeprrafopredeter"/>
-    <w:link w:val="Textocomentario"/>
+  <w:style w:type="character" w:customStyle="1" w:styleId="CommentTextChar">
+    <w:name w:val="Comment Text Char"/>
+    <w:basedOn w:val="DefaultParagraphFont"/>
+    <w:link w:val="CommentText"/>
     <w:uiPriority w:val="99"/>
     <w:rsid w:val="00B5482D"/>
     <w:rPr>
@@ -9991,11 +10185,11 @@
       <w:szCs w:val="20"/>
     </w:rPr>
   </w:style>
-  <w:style w:type="paragraph" w:styleId="Asuntodelcomentario">
+  <w:style w:type="paragraph" w:styleId="CommentSubject">
     <w:name w:val="annotation subject"/>
-    <w:basedOn w:val="Textocomentario"/>
-    <w:next w:val="Textocomentario"/>
-    <w:link w:val="AsuntodelcomentarioCar"/>
+    <w:basedOn w:val="CommentText"/>
+    <w:next w:val="CommentText"/>
+    <w:link w:val="CommentSubjectChar"/>
     <w:uiPriority w:val="99"/>
     <w:semiHidden/>
     <w:unhideWhenUsed/>
@@ -10005,10 +10199,10 @@
       <w:bCs/>
     </w:rPr>
   </w:style>
-  <w:style w:type="character" w:customStyle="1" w:styleId="AsuntodelcomentarioCar">
-    <w:name w:val="Asunto del comentario Car"/>
-    <w:basedOn w:val="TextocomentarioCar"/>
-    <w:link w:val="Asuntodelcomentario"/>
+  <w:style w:type="character" w:customStyle="1" w:styleId="CommentSubjectChar">
+    <w:name w:val="Comment Subject Char"/>
+    <w:basedOn w:val="CommentTextChar"/>
+    <w:link w:val="CommentSubject"/>
     <w:uiPriority w:val="99"/>
     <w:semiHidden/>
     <w:rsid w:val="00B5482D"/>
@@ -10019,10 +10213,10 @@
       <w:szCs w:val="20"/>
     </w:rPr>
   </w:style>
-  <w:style w:type="paragraph" w:styleId="Textodeglobo">
+  <w:style w:type="paragraph" w:styleId="BalloonText">
     <w:name w:val="Balloon Text"/>
     <w:basedOn w:val="Normal"/>
-    <w:link w:val="TextodegloboCar"/>
+    <w:link w:val="BalloonTextChar"/>
     <w:uiPriority w:val="99"/>
     <w:semiHidden/>
     <w:unhideWhenUsed/>
@@ -10033,10 +10227,10 @@
       <w:szCs w:val="18"/>
     </w:rPr>
   </w:style>
-  <w:style w:type="character" w:customStyle="1" w:styleId="TextodegloboCar">
-    <w:name w:val="Texto de globo Car"/>
-    <w:basedOn w:val="Fuentedeprrafopredeter"/>
-    <w:link w:val="Textodeglobo"/>
+  <w:style w:type="character" w:customStyle="1" w:styleId="BalloonTextChar">
+    <w:name w:val="Balloon Text Char"/>
+    <w:basedOn w:val="DefaultParagraphFont"/>
+    <w:link w:val="BalloonText"/>
     <w:uiPriority w:val="99"/>
     <w:semiHidden/>
     <w:rsid w:val="00B5482D"/>
@@ -10046,7 +10240,7 @@
       <w:szCs w:val="18"/>
     </w:rPr>
   </w:style>
-  <w:style w:type="paragraph" w:styleId="Prrafodelista">
+  <w:style w:type="paragraph" w:styleId="ListParagraph">
     <w:name w:val="List Paragraph"/>
     <w:basedOn w:val="Normal"/>
     <w:uiPriority w:val="34"/>
@@ -10057,7 +10251,7 @@
       <w:contextualSpacing/>
     </w:pPr>
   </w:style>
-  <w:style w:type="paragraph" w:styleId="Subttulo">
+  <w:style w:type="paragraph" w:styleId="Subtitle">
     <w:name w:val="Subtitle"/>
     <w:basedOn w:val="Normal"/>
     <w:next w:val="Normal"/>
@@ -10078,7 +10272,7 @@
     </w:rPr>
   </w:style>
   <w:style w:type="table" w:customStyle="1" w:styleId="a">
-    <w:basedOn w:val="TableNormal"/>
+    <w:basedOn w:val="TableNormal0"/>
     <w:tblPr>
       <w:tblStyleRowBandSize w:val="1"/>
       <w:tblStyleColBandSize w:val="1"/>
@@ -10091,7 +10285,7 @@
     </w:tblPr>
   </w:style>
   <w:style w:type="table" w:customStyle="1" w:styleId="a0">
-    <w:basedOn w:val="TableNormal"/>
+    <w:basedOn w:val="TableNormal0"/>
     <w:tblPr>
       <w:tblStyleRowBandSize w:val="1"/>
       <w:tblStyleColBandSize w:val="1"/>
@@ -10103,17 +10297,17 @@
       </w:tblCellMar>
     </w:tblPr>
   </w:style>
-  <w:style w:type="paragraph" w:styleId="Revisin">
+  <w:style w:type="paragraph" w:styleId="Revision">
     <w:name w:val="Revision"/>
     <w:hidden/>
     <w:uiPriority w:val="99"/>
     <w:semiHidden/>
     <w:rsid w:val="009E391B"/>
   </w:style>
-  <w:style w:type="paragraph" w:styleId="Encabezado">
+  <w:style w:type="paragraph" w:styleId="Header">
     <w:name w:val="header"/>
     <w:basedOn w:val="Normal"/>
-    <w:link w:val="EncabezadoCar"/>
+    <w:link w:val="HeaderChar"/>
     <w:uiPriority w:val="99"/>
     <w:unhideWhenUsed/>
     <w:rsid w:val="005070C8"/>
@@ -10124,17 +10318,17 @@
       </w:tabs>
     </w:pPr>
   </w:style>
-  <w:style w:type="character" w:customStyle="1" w:styleId="EncabezadoCar">
-    <w:name w:val="Encabezado Car"/>
-    <w:basedOn w:val="Fuentedeprrafopredeter"/>
-    <w:link w:val="Encabezado"/>
+  <w:style w:type="character" w:customStyle="1" w:styleId="HeaderChar">
+    <w:name w:val="Header Char"/>
+    <w:basedOn w:val="DefaultParagraphFont"/>
+    <w:link w:val="Header"/>
     <w:uiPriority w:val="99"/>
     <w:rsid w:val="005070C8"/>
   </w:style>
-  <w:style w:type="paragraph" w:styleId="Piedepgina">
+  <w:style w:type="paragraph" w:styleId="Footer">
     <w:name w:val="footer"/>
     <w:basedOn w:val="Normal"/>
-    <w:link w:val="PiedepginaCar"/>
+    <w:link w:val="FooterChar"/>
     <w:uiPriority w:val="99"/>
     <w:unhideWhenUsed/>
     <w:rsid w:val="005070C8"/>
@@ -10145,16 +10339,16 @@
       </w:tabs>
     </w:pPr>
   </w:style>
-  <w:style w:type="character" w:customStyle="1" w:styleId="PiedepginaCar">
-    <w:name w:val="Pie de página Car"/>
-    <w:basedOn w:val="Fuentedeprrafopredeter"/>
-    <w:link w:val="Piedepgina"/>
+  <w:style w:type="character" w:customStyle="1" w:styleId="FooterChar">
+    <w:name w:val="Footer Char"/>
+    <w:basedOn w:val="DefaultParagraphFont"/>
+    <w:link w:val="Footer"/>
     <w:uiPriority w:val="99"/>
     <w:rsid w:val="005070C8"/>
   </w:style>
-  <w:style w:type="character" w:styleId="Hipervnculo">
+  <w:style w:type="character" w:styleId="Hyperlink">
     <w:name w:val="Hyperlink"/>
-    <w:basedOn w:val="Fuentedeprrafopredeter"/>
+    <w:basedOn w:val="DefaultParagraphFont"/>
     <w:uiPriority w:val="99"/>
     <w:unhideWhenUsed/>
     <w:rsid w:val="00047F03"/>
@@ -10163,9 +10357,9 @@
       <w:u w:val="single"/>
     </w:rPr>
   </w:style>
-  <w:style w:type="character" w:styleId="Mencinsinresolver">
+  <w:style w:type="character" w:styleId="UnresolvedMention">
     <w:name w:val="Unresolved Mention"/>
-    <w:basedOn w:val="Fuentedeprrafopredeter"/>
+    <w:basedOn w:val="DefaultParagraphFont"/>
     <w:uiPriority w:val="99"/>
     <w:semiHidden/>
     <w:unhideWhenUsed/>
@@ -10189,9 +10383,9 @@
       <w:lang w:val="es-EC" w:eastAsia="es-ES_tradnl"/>
     </w:rPr>
   </w:style>
-  <w:style w:type="character" w:styleId="Textoennegrita">
+  <w:style w:type="character" w:styleId="Strong">
     <w:name w:val="Strong"/>
-    <w:basedOn w:val="Fuentedeprrafopredeter"/>
+    <w:basedOn w:val="DefaultParagraphFont"/>
     <w:uiPriority w:val="22"/>
     <w:qFormat/>
     <w:rsid w:val="00EA0DBE"/>
@@ -10200,9 +10394,9 @@
       <w:bCs/>
     </w:rPr>
   </w:style>
-  <w:style w:type="character" w:styleId="nfasis">
+  <w:style w:type="character" w:styleId="Emphasis">
     <w:name w:val="Emphasis"/>
-    <w:basedOn w:val="Fuentedeprrafopredeter"/>
+    <w:basedOn w:val="DefaultParagraphFont"/>
     <w:uiPriority w:val="20"/>
     <w:qFormat/>
     <w:rsid w:val="00837442"/>
@@ -10211,9 +10405,9 @@
       <w:iCs/>
     </w:rPr>
   </w:style>
-  <w:style w:type="character" w:styleId="CdigoHTML">
+  <w:style w:type="character" w:styleId="HTMLCode">
     <w:name w:val="HTML Code"/>
-    <w:basedOn w:val="Fuentedeprrafopredeter"/>
+    <w:basedOn w:val="DefaultParagraphFont"/>
     <w:uiPriority w:val="99"/>
     <w:semiHidden/>
     <w:unhideWhenUsed/>
@@ -10224,7 +10418,7 @@
       <w:szCs w:val="20"/>
     </w:rPr>
   </w:style>
-  <w:style w:type="paragraph" w:styleId="Bibliografa">
+  <w:style w:type="paragraph" w:styleId="Bibliography">
     <w:name w:val="Bibliography"/>
     <w:basedOn w:val="Normal"/>
     <w:next w:val="Normal"/>
@@ -10239,9 +10433,9 @@
       <w:ind w:left="384" w:hanging="384"/>
     </w:pPr>
   </w:style>
-  <w:style w:type="character" w:styleId="Textodelmarcadordeposicin">
+  <w:style w:type="character" w:styleId="PlaceholderText">
     <w:name w:val="Placeholder Text"/>
-    <w:basedOn w:val="Fuentedeprrafopredeter"/>
+    <w:basedOn w:val="DefaultParagraphFont"/>
     <w:uiPriority w:val="99"/>
     <w:semiHidden/>
     <w:rsid w:val="00747FFA"/>
@@ -10253,7 +10447,7 @@
 </file>
 
 <file path=word/glossary/document.xml><?xml version="1.0" encoding="utf-8"?>
-<w:glossaryDocument xmlns:wpc="http://schemas.microsoft.com/office/word/2010/wordprocessingCanvas" xmlns:cx="http://schemas.microsoft.com/office/drawing/2014/chartex" xmlns:cx1="http://schemas.microsoft.com/office/drawing/2015/9/8/chartex" xmlns:cx2="http://schemas.microsoft.com/office/drawing/2015/10/21/chartex" xmlns:cx3="http://schemas.microsoft.com/office/drawing/2016/5/9/chartex" xmlns:cx4="http://schemas.microsoft.com/office/drawing/2016/5/10/chartex" xmlns:cx5="http://schemas.microsoft.com/office/drawing/2016/5/11/chartex" xmlns:cx6="http://schemas.microsoft.com/office/drawing/2016/5/12/chartex" xmlns:cx7="http://schemas.microsoft.com/office/drawing/2016/5/13/chartex" xmlns:cx8="http://schemas.microsoft.com/office/drawing/2016/5/14/chartex" xmlns:mc="http://schemas.openxmlformats.org/markup-compatibility/2006" xmlns:aink="http://schemas.microsoft.com/office/drawing/2016/ink" xmlns:am3d="http://schemas.microsoft.com/office/drawing/2017/model3d" xmlns:o="urn:schemas-microsoft-com:office:office" xmlns:r="http://schemas.openxmlformats.org/officeDocument/2006/relationships" xmlns:m="http://schemas.openxmlformats.org/officeDocument/2006/math" xmlns:v="urn:schemas-microsoft-com:vml" xmlns:wp14="http://schemas.microsoft.com/office/word/2010/wordprocessingDrawing" xmlns:wp="http://schemas.openxmlformats.org/drawingml/2006/wordprocessingDrawing" xmlns:w10="urn:schemas-microsoft-com:office:word" xmlns:w="http://schemas.openxmlformats.org/wordprocessingml/2006/main" xmlns:w14="http://schemas.microsoft.com/office/word/2010/wordml" xmlns:w15="http://schemas.microsoft.com/office/word/2012/wordml" xmlns:w16cid="http://schemas.microsoft.com/office/word/2016/wordml/cid" xmlns:w16se="http://schemas.microsoft.com/office/word/2015/wordml/symex" xmlns:wpg="http://schemas.microsoft.com/office/word/2010/wordprocessingGroup" xmlns:wpi="http://schemas.microsoft.com/office/word/2010/wordprocessingInk" xmlns:wne="http://schemas.microsoft.com/office/word/2006/wordml" xmlns:wps="http://schemas.microsoft.com/office/word/2010/wordprocessingShape" mc:Ignorable="w14 w15 w16se w16cid wp14">
+<w:glossaryDocument xmlns:wpc="http://schemas.microsoft.com/office/word/2010/wordprocessingCanvas" xmlns:cx="http://schemas.microsoft.com/office/drawing/2014/chartex" xmlns:cx1="http://schemas.microsoft.com/office/drawing/2015/9/8/chartex" xmlns:cx2="http://schemas.microsoft.com/office/drawing/2015/10/21/chartex" xmlns:cx3="http://schemas.microsoft.com/office/drawing/2016/5/9/chartex" xmlns:cx4="http://schemas.microsoft.com/office/drawing/2016/5/10/chartex" xmlns:cx5="http://schemas.microsoft.com/office/drawing/2016/5/11/chartex" xmlns:cx6="http://schemas.microsoft.com/office/drawing/2016/5/12/chartex" xmlns:cx7="http://schemas.microsoft.com/office/drawing/2016/5/13/chartex" xmlns:cx8="http://schemas.microsoft.com/office/drawing/2016/5/14/chartex" xmlns:mc="http://schemas.openxmlformats.org/markup-compatibility/2006" xmlns:aink="http://schemas.microsoft.com/office/drawing/2016/ink" xmlns:am3d="http://schemas.microsoft.com/office/drawing/2017/model3d" xmlns:o="urn:schemas-microsoft-com:office:office" xmlns:oel="http://schemas.microsoft.com/office/2019/extlst" xmlns:r="http://schemas.openxmlformats.org/officeDocument/2006/relationships" xmlns:m="http://schemas.openxmlformats.org/officeDocument/2006/math" xmlns:v="urn:schemas-microsoft-com:vml" xmlns:wp14="http://schemas.microsoft.com/office/word/2010/wordprocessingDrawing" xmlns:wp="http://schemas.openxmlformats.org/drawingml/2006/wordprocessingDrawing" xmlns:w10="urn:schemas-microsoft-com:office:word" xmlns:w="http://schemas.openxmlformats.org/wordprocessingml/2006/main" xmlns:w14="http://schemas.microsoft.com/office/word/2010/wordml" xmlns:w15="http://schemas.microsoft.com/office/word/2012/wordml" xmlns:w16cex="http://schemas.microsoft.com/office/word/2018/wordml/cex" xmlns:w16cid="http://schemas.microsoft.com/office/word/2016/wordml/cid" xmlns:w16="http://schemas.microsoft.com/office/word/2018/wordml" xmlns:w16du="http://schemas.microsoft.com/office/word/2023/wordml/word16du" xmlns:w16sdtdh="http://schemas.microsoft.com/office/word/2020/wordml/sdtdatahash" xmlns:w16sdtfl="http://schemas.microsoft.com/office/word/2024/wordml/sdtformatlock" xmlns:w16se="http://schemas.microsoft.com/office/word/2015/wordml/symex" xmlns:wpg="http://schemas.microsoft.com/office/word/2010/wordprocessingGroup" xmlns:wpi="http://schemas.microsoft.com/office/word/2010/wordprocessingInk" xmlns:wne="http://schemas.microsoft.com/office/word/2006/wordml" xmlns:wps="http://schemas.microsoft.com/office/word/2010/wordprocessingShape" mc:Ignorable="w14 w15 w16se w16cid w16 w16cex w16sdtdh w16sdtfl w16du wp14">
   <w:docParts>
     <w:docPart>
       <w:docPartPr>
@@ -10274,7 +10468,7 @@
         <w:p>
           <w:r>
             <w:rPr>
-              <w:rStyle w:val="Textodelmarcadordeposicin"/>
+              <w:rStyle w:val="PlaceholderText"/>
             </w:rPr>
             <w:t>Haga clic o pulse aquí para escribir texto.</w:t>
           </w:r>
@@ -10303,7 +10497,7 @@
           </w:pPr>
           <w:r>
             <w:rPr>
-              <w:rStyle w:val="Textodelmarcadordeposicin"/>
+              <w:rStyle w:val="PlaceholderText"/>
             </w:rPr>
             <w:t>Haga clic o pulse aquí para escribir texto.</w:t>
           </w:r>
@@ -10332,7 +10526,7 @@
           </w:pPr>
           <w:r>
             <w:rPr>
-              <w:rStyle w:val="Textodelmarcadordeposicin"/>
+              <w:rStyle w:val="PlaceholderText"/>
             </w:rPr>
             <w:t>Haga clic o pulse aquí para escribir texto.</w:t>
           </w:r>
@@ -10361,7 +10555,7 @@
           </w:pPr>
           <w:r>
             <w:rPr>
-              <w:rStyle w:val="Textodelmarcadordeposicin"/>
+              <w:rStyle w:val="PlaceholderText"/>
             </w:rPr>
             <w:t>Haga clic o pulse aquí para escribir texto.</w:t>
           </w:r>
@@ -10373,11 +10567,11 @@
 </file>
 
 <file path=word/glossary/fontTable.xml><?xml version="1.0" encoding="utf-8"?>
-<w:fonts xmlns:mc="http://schemas.openxmlformats.org/markup-compatibility/2006" xmlns:r="http://schemas.openxmlformats.org/officeDocument/2006/relationships" xmlns:w="http://schemas.openxmlformats.org/wordprocessingml/2006/main" xmlns:w14="http://schemas.microsoft.com/office/word/2010/wordml" xmlns:w15="http://schemas.microsoft.com/office/word/2012/wordml" xmlns:w16cid="http://schemas.microsoft.com/office/word/2016/wordml/cid" xmlns:w16se="http://schemas.microsoft.com/office/word/2015/wordml/symex" mc:Ignorable="w14 w15 w16se w16cid">
+<w:fonts xmlns:mc="http://schemas.openxmlformats.org/markup-compatibility/2006" xmlns:r="http://schemas.openxmlformats.org/officeDocument/2006/relationships" xmlns:w="http://schemas.openxmlformats.org/wordprocessingml/2006/main" xmlns:w14="http://schemas.microsoft.com/office/word/2010/wordml" xmlns:w15="http://schemas.microsoft.com/office/word/2012/wordml" xmlns:w16cex="http://schemas.microsoft.com/office/word/2018/wordml/cex" xmlns:w16cid="http://schemas.microsoft.com/office/word/2016/wordml/cid" xmlns:w16="http://schemas.microsoft.com/office/word/2018/wordml" xmlns:w16du="http://schemas.microsoft.com/office/word/2023/wordml/word16du" xmlns:w16sdtdh="http://schemas.microsoft.com/office/word/2020/wordml/sdtdatahash" xmlns:w16sdtfl="http://schemas.microsoft.com/office/word/2024/wordml/sdtformatlock" xmlns:w16se="http://schemas.microsoft.com/office/word/2015/wordml/symex" mc:Ignorable="w14 w15 w16se w16cid w16 w16cex w16sdtdh w16sdtfl w16du">
   <w:font w:name="Symbol">
     <w:panose1 w:val="05050102010706020507"/>
     <w:charset w:val="02"/>
-    <w:family w:val="decorative"/>
+    <w:family w:val="roman"/>
     <w:pitch w:val="variable"/>
     <w:sig w:usb0="00000000" w:usb1="10000000" w:usb2="00000000" w:usb3="00000000" w:csb0="80000000" w:csb1="00000000"/>
   </w:font>
@@ -10393,12 +10587,12 @@
     <w:charset w:val="00"/>
     <w:family w:val="modern"/>
     <w:pitch w:val="fixed"/>
-    <w:sig w:usb0="E0002AFF" w:usb1="C0007843" w:usb2="00000009" w:usb3="00000000" w:csb0="000001FF" w:csb1="00000000"/>
+    <w:sig w:usb0="E0002EFF" w:usb1="C0007843" w:usb2="00000009" w:usb3="00000000" w:csb0="000001FF" w:csb1="00000000"/>
   </w:font>
   <w:font w:name="Wingdings">
     <w:panose1 w:val="05000000000000000000"/>
     <w:charset w:val="02"/>
-    <w:family w:val="decorative"/>
+    <w:family w:val="auto"/>
     <w:pitch w:val="variable"/>
     <w:sig w:usb0="00000000" w:usb1="10000000" w:usb2="00000000" w:usb3="00000000" w:csb0="80000000" w:csb1="00000000"/>
   </w:font>
@@ -10407,7 +10601,7 @@
     <w:charset w:val="00"/>
     <w:family w:val="swiss"/>
     <w:pitch w:val="variable"/>
-    <w:sig w:usb0="E0002AFF" w:usb1="C000247B" w:usb2="00000009" w:usb3="00000000" w:csb0="000001FF" w:csb1="00000000"/>
+    <w:sig w:usb0="E4002EFF" w:usb1="C200247B" w:usb2="00000009" w:usb3="00000000" w:csb0="000001FF" w:csb1="00000000"/>
   </w:font>
   <w:font w:name="Georgia">
     <w:panose1 w:val="02040502050405020303"/>
@@ -10421,13 +10615,25 @@
     <w:charset w:val="00"/>
     <w:family w:val="swiss"/>
     <w:pitch w:val="variable"/>
-    <w:sig w:usb0="E0002AFF" w:usb1="C000247B" w:usb2="00000009" w:usb3="00000000" w:csb0="000001FF" w:csb1="00000000"/>
+    <w:sig w:usb0="E4002EFF" w:usb1="C200247B" w:usb2="00000009" w:usb3="00000000" w:csb0="000001FF" w:csb1="00000000"/>
+  </w:font>
+  <w:font w:name="Aptos">
+    <w:charset w:val="00"/>
+    <w:family w:val="swiss"/>
+    <w:pitch w:val="variable"/>
+    <w:sig w:usb0="20000287" w:usb1="00000003" w:usb2="00000000" w:usb3="00000000" w:csb0="0000019F" w:csb1="00000000"/>
+  </w:font>
+  <w:font w:name="Aptos Display">
+    <w:charset w:val="00"/>
+    <w:family w:val="swiss"/>
+    <w:pitch w:val="variable"/>
+    <w:sig w:usb0="20000287" w:usb1="00000003" w:usb2="00000000" w:usb3="00000000" w:csb0="0000019F" w:csb1="00000000"/>
   </w:font>
 </w:fonts>
 </file>
 
 <file path=word/glossary/settings.xml><?xml version="1.0" encoding="utf-8"?>
-<w:settings xmlns:mc="http://schemas.openxmlformats.org/markup-compatibility/2006" xmlns:o="urn:schemas-microsoft-com:office:office" xmlns:r="http://schemas.openxmlformats.org/officeDocument/2006/relationships" xmlns:m="http://schemas.openxmlformats.org/officeDocument/2006/math" xmlns:v="urn:schemas-microsoft-com:vml" xmlns:w10="urn:schemas-microsoft-com:office:word" xmlns:w="http://schemas.openxmlformats.org/wordprocessingml/2006/main" xmlns:w14="http://schemas.microsoft.com/office/word/2010/wordml" xmlns:w15="http://schemas.microsoft.com/office/word/2012/wordml" xmlns:w16cid="http://schemas.microsoft.com/office/word/2016/wordml/cid" xmlns:w16se="http://schemas.microsoft.com/office/word/2015/wordml/symex" xmlns:sl="http://schemas.openxmlformats.org/schemaLibrary/2006/main" mc:Ignorable="w14 w15 w16se w16cid">
+<w:settings xmlns:mc="http://schemas.openxmlformats.org/markup-compatibility/2006" xmlns:o="urn:schemas-microsoft-com:office:office" xmlns:r="http://schemas.openxmlformats.org/officeDocument/2006/relationships" xmlns:m="http://schemas.openxmlformats.org/officeDocument/2006/math" xmlns:v="urn:schemas-microsoft-com:vml" xmlns:w10="urn:schemas-microsoft-com:office:word" xmlns:w="http://schemas.openxmlformats.org/wordprocessingml/2006/main" xmlns:w14="http://schemas.microsoft.com/office/word/2010/wordml" xmlns:w15="http://schemas.microsoft.com/office/word/2012/wordml" xmlns:w16cex="http://schemas.microsoft.com/office/word/2018/wordml/cex" xmlns:w16cid="http://schemas.microsoft.com/office/word/2016/wordml/cid" xmlns:w16="http://schemas.microsoft.com/office/word/2018/wordml" xmlns:w16du="http://schemas.microsoft.com/office/word/2023/wordml/word16du" xmlns:w16sdtdh="http://schemas.microsoft.com/office/word/2020/wordml/sdtdatahash" xmlns:w16sdtfl="http://schemas.microsoft.com/office/word/2024/wordml/sdtformatlock" xmlns:w16se="http://schemas.microsoft.com/office/word/2015/wordml/symex" xmlns:sl="http://schemas.openxmlformats.org/schemaLibrary/2006/main" mc:Ignorable="w14 w15 w16se w16cid w16 w16cex w16sdtdh w16sdtfl w16du">
   <w:view w:val="normal"/>
   <w:revisionView w:insDel="0" w:formatting="0"/>
   <w:defaultTabStop w:val="708"/>
@@ -10445,15 +10651,19 @@
   <w:rsids>
     <w:rsidRoot w:val="001F7673"/>
     <w:rsid w:val="00007F32"/>
+    <w:rsid w:val="0001539C"/>
     <w:rsid w:val="000669C8"/>
     <w:rsid w:val="001F7673"/>
     <w:rsid w:val="002379EA"/>
+    <w:rsid w:val="00281C86"/>
     <w:rsid w:val="002E39D9"/>
     <w:rsid w:val="00583927"/>
     <w:rsid w:val="008328A7"/>
     <w:rsid w:val="008F26FD"/>
     <w:rsid w:val="00A70C62"/>
+    <w:rsid w:val="00D35D48"/>
     <w:rsid w:val="00F05CEA"/>
+    <w:rsid w:val="00F16133"/>
   </w:rsids>
   <m:mathPr>
     <m:mathFont m:val="Cambria Math"/>
@@ -10471,13 +10681,13 @@
   <w:themeFontLang w:val="es-EC"/>
   <w:clrSchemeMapping w:bg1="light1" w:t1="dark1" w:bg2="light2" w:t2="dark2" w:accent1="accent1" w:accent2="accent2" w:accent3="accent3" w:accent4="accent4" w:accent5="accent5" w:accent6="accent6" w:hyperlink="hyperlink" w:followedHyperlink="followedHyperlink"/>
   <w:decimalSymbol w:val=","/>
-  <w:listSeparator w:val=","/>
+  <w:listSeparator w:val=";"/>
   <w15:chartTrackingRefBased/>
 </w:settings>
 </file>
 
 <file path=word/glossary/styles.xml><?xml version="1.0" encoding="utf-8"?>
-<w:styles xmlns:mc="http://schemas.openxmlformats.org/markup-compatibility/2006" xmlns:r="http://schemas.openxmlformats.org/officeDocument/2006/relationships" xmlns:w="http://schemas.openxmlformats.org/wordprocessingml/2006/main" xmlns:w14="http://schemas.microsoft.com/office/word/2010/wordml" xmlns:w15="http://schemas.microsoft.com/office/word/2012/wordml" xmlns:w16cid="http://schemas.microsoft.com/office/word/2016/wordml/cid" xmlns:w16se="http://schemas.microsoft.com/office/word/2015/wordml/symex" mc:Ignorable="w14 w15 w16se w16cid">
+<w:styles xmlns:mc="http://schemas.openxmlformats.org/markup-compatibility/2006" xmlns:r="http://schemas.openxmlformats.org/officeDocument/2006/relationships" xmlns:w="http://schemas.openxmlformats.org/wordprocessingml/2006/main" xmlns:w14="http://schemas.microsoft.com/office/word/2010/wordml" xmlns:w15="http://schemas.microsoft.com/office/word/2012/wordml" xmlns:w16cex="http://schemas.microsoft.com/office/word/2018/wordml/cex" xmlns:w16cid="http://schemas.microsoft.com/office/word/2016/wordml/cid" xmlns:w16="http://schemas.microsoft.com/office/word/2018/wordml" xmlns:w16du="http://schemas.microsoft.com/office/word/2023/wordml/word16du" xmlns:w16sdtdh="http://schemas.microsoft.com/office/word/2020/wordml/sdtdatahash" xmlns:w16sdtfl="http://schemas.microsoft.com/office/word/2024/wordml/sdtformatlock" xmlns:w16se="http://schemas.microsoft.com/office/word/2015/wordml/symex" mc:Ignorable="w14 w15 w16se w16cid w16 w16cex w16sdtdh w16sdtfl w16du">
   <w:docDefaults>
     <w:rPrDefault>
       <w:rPr>
@@ -10489,7 +10699,7 @@
     </w:rPrDefault>
     <w:pPrDefault/>
   </w:docDefaults>
-  <w:latentStyles w:defLockedState="0" w:defUIPriority="99" w:defSemiHidden="0" w:defUnhideWhenUsed="0" w:defQFormat="0" w:count="375">
+  <w:latentStyles w:defLockedState="0" w:defUIPriority="99" w:defSemiHidden="0" w:defUnhideWhenUsed="0" w:defQFormat="0" w:count="376">
     <w:lsdException w:name="Normal" w:uiPriority="0" w:qFormat="1"/>
     <w:lsdException w:name="heading 1" w:uiPriority="9" w:qFormat="1"/>
     <w:lsdException w:name="heading 2" w:semiHidden="1" w:uiPriority="9" w:unhideWhenUsed="1" w:qFormat="1"/>
@@ -10865,18 +11075,19 @@
     <w:lsdException w:name="Smart Hyperlink" w:semiHidden="1" w:unhideWhenUsed="1"/>
     <w:lsdException w:name="Hashtag" w:semiHidden="1" w:unhideWhenUsed="1"/>
     <w:lsdException w:name="Unresolved Mention" w:semiHidden="1" w:unhideWhenUsed="1"/>
+    <w:lsdException w:name="Smart Link" w:semiHidden="1" w:unhideWhenUsed="1"/>
   </w:latentStyles>
   <w:style w:type="paragraph" w:default="1" w:styleId="Normal">
     <w:name w:val="Normal"/>
     <w:qFormat/>
   </w:style>
-  <w:style w:type="character" w:default="1" w:styleId="Fuentedeprrafopredeter">
+  <w:style w:type="character" w:default="1" w:styleId="DefaultParagraphFont">
     <w:name w:val="Default Paragraph Font"/>
     <w:uiPriority w:val="1"/>
     <w:semiHidden/>
     <w:unhideWhenUsed/>
   </w:style>
-  <w:style w:type="table" w:default="1" w:styleId="Tablanormal">
+  <w:style w:type="table" w:default="1" w:styleId="TableNormal">
     <w:name w:val="Normal Table"/>
     <w:uiPriority w:val="99"/>
     <w:semiHidden/>
@@ -10891,15 +11102,15 @@
       </w:tblCellMar>
     </w:tblPr>
   </w:style>
-  <w:style w:type="numbering" w:default="1" w:styleId="Sinlista">
+  <w:style w:type="numbering" w:default="1" w:styleId="NoList">
     <w:name w:val="No List"/>
     <w:uiPriority w:val="99"/>
     <w:semiHidden/>
     <w:unhideWhenUsed/>
   </w:style>
-  <w:style w:type="character" w:styleId="Textodelmarcadordeposicin">
+  <w:style w:type="character" w:styleId="PlaceholderText">
     <w:name w:val="Placeholder Text"/>
-    <w:basedOn w:val="Fuentedeprrafopredeter"/>
+    <w:basedOn w:val="DefaultParagraphFont"/>
     <w:uiPriority w:val="99"/>
     <w:semiHidden/>
     <w:rsid w:val="001F7673"/>
@@ -10923,7 +11134,7 @@
 </file>
 
 <file path=word/glossary/webSettings.xml><?xml version="1.0" encoding="utf-8"?>
-<w:webSettings xmlns:mc="http://schemas.openxmlformats.org/markup-compatibility/2006" xmlns:r="http://schemas.openxmlformats.org/officeDocument/2006/relationships" xmlns:w="http://schemas.openxmlformats.org/wordprocessingml/2006/main" xmlns:w14="http://schemas.microsoft.com/office/word/2010/wordml" xmlns:w15="http://schemas.microsoft.com/office/word/2012/wordml" xmlns:w16cid="http://schemas.microsoft.com/office/word/2016/wordml/cid" xmlns:w16se="http://schemas.microsoft.com/office/word/2015/wordml/symex" mc:Ignorable="w14 w15 w16se w16cid">
+<w:webSettings xmlns:mc="http://schemas.openxmlformats.org/markup-compatibility/2006" xmlns:r="http://schemas.openxmlformats.org/officeDocument/2006/relationships" xmlns:w="http://schemas.openxmlformats.org/wordprocessingml/2006/main" xmlns:w14="http://schemas.microsoft.com/office/word/2010/wordml" xmlns:w15="http://schemas.microsoft.com/office/word/2012/wordml" xmlns:w16cex="http://schemas.microsoft.com/office/word/2018/wordml/cex" xmlns:w16cid="http://schemas.microsoft.com/office/word/2016/wordml/cid" xmlns:w16="http://schemas.microsoft.com/office/word/2018/wordml" xmlns:w16du="http://schemas.microsoft.com/office/word/2023/wordml/word16du" xmlns:w16sdtdh="http://schemas.microsoft.com/office/word/2020/wordml/sdtdatahash" xmlns:w16sdtfl="http://schemas.microsoft.com/office/word/2024/wordml/sdtformatlock" xmlns:w16se="http://schemas.microsoft.com/office/word/2015/wordml/symex" mc:Ignorable="w14 w15 w16se w16cid w16 w16cex w16sdtdh w16sdtfl w16du">
   <w:optimizeForBrowser/>
   <w:allowPNG/>
 </w:webSettings>

</xml_diff>